<commit_message>
Expand degree market reports to eight pages
</commit_message>
<xml_diff>
--- a/implementations/reports/Business_Analytics_Market_Alignment_Report.docx
+++ b/implementations/reports/Business_Analytics_Market_Alignment_Report.docx
@@ -604,6 +604,11 @@
       </w:pPr>
       <w:r>
         <w:t>Job Titles Represented</w:t>
+      </w:r>
+    </w:p>
+    <w:p>
+      <w:r>
+        <w:t>The table preserves the employer-posted title rather than replacing it with a standardized label. This makes the report useful for student job searches while the role-family mapping supports aggregation.</w:t>
       </w:r>
     </w:p>
     <w:tbl>
@@ -1402,6 +1407,11 @@
       <w:pPr>
         <w:spacing w:after="0"/>
       </w:pPr>
+    </w:p>
+    <w:p>
+      <w:r>
+        <w:br w:type="page"/>
+      </w:r>
     </w:p>
     <w:p>
       <w:pPr>
@@ -3910,6 +3920,56 @@
     </w:p>
     <w:p>
       <w:pPr>
+        <w:pStyle w:val="Heading2"/>
+      </w:pPr>
+      <w:r>
+        <w:t>How to Read Skill Demand</w:t>
+      </w:r>
+    </w:p>
+    <w:p>
+      <w:r>
+        <w:t>Jobs is the number of distinct descriptions that explicitly mention the skill. Demand share divides that count by all qualified jobs for this degree. A repeated term within one posting counts once, preventing long descriptions from receiving extra weight.</w:t>
+      </w:r>
+    </w:p>
+    <w:p>
+      <w:pPr>
+        <w:pStyle w:val="ListBullet"/>
+      </w:pPr>
+      <w:r>
+        <w:t>High-frequency skills should be visible in learning outcomes and assessed work when they fit the academic purpose of the degree.</w:t>
+      </w:r>
+    </w:p>
+    <w:p>
+      <w:pPr>
+        <w:pStyle w:val="ListBullet"/>
+      </w:pPr>
+      <w:r>
+        <w:t>Lower-frequency skills can still matter when they define a specialized role family or fast-growing technology area.</w:t>
+      </w:r>
+    </w:p>
+    <w:p>
+      <w:pPr>
+        <w:pStyle w:val="ListBullet"/>
+      </w:pPr>
+      <w:r>
+        <w:t>Tool names should be interpreted with transferable concepts; for example, a cloud-platform requirement may represent architecture, security, deployment, and cost-management abilities.</w:t>
+      </w:r>
+    </w:p>
+    <w:p>
+      <w:pPr>
+        <w:pStyle w:val="ListBullet"/>
+      </w:pPr>
+      <w:r>
+        <w:t>Communication and stakeholder skills require observable evidence such as presentations, requirements documents, decision logs, and team delivery artifacts.</w:t>
+      </w:r>
+    </w:p>
+    <w:p>
+      <w:r>
+        <w:br w:type="page"/>
+      </w:r>
+    </w:p>
+    <w:p>
+      <w:pPr>
         <w:pStyle w:val="Heading1"/>
       </w:pPr>
       <w:r>
@@ -4650,6 +4710,461 @@
     </w:p>
     <w:p>
       <w:pPr>
+        <w:pStyle w:val="Heading2"/>
+      </w:pPr>
+      <w:r>
+        <w:t>Collection Architecture</w:t>
+      </w:r>
+    </w:p>
+    <w:tbl>
+      <w:tblPr>
+        <w:tblW w:type="auto" w:w="0"/>
+        <w:jc w:val="center"/>
+        <w:tblLayout w:type="fixed"/>
+        <w:tblLook w:firstColumn="1" w:firstRow="1" w:lastColumn="0" w:lastRow="0" w:noHBand="0" w:noVBand="1" w:val="04A0"/>
+      </w:tblPr>
+      <w:tblGrid>
+        <w:gridCol w:w="4997"/>
+        <w:gridCol w:w="4997"/>
+      </w:tblGrid>
+      <w:tr>
+        <w:tc>
+          <w:tcPr>
+            <w:tcW w:type="dxa" w:w="1728"/>
+            <w:shd w:fill="17365D"/>
+            <w:tcBorders>
+              <w:top w:val="single" w:sz="6" w:color="D9D9D9"/>
+              <w:left w:val="single" w:sz="6" w:color="D9D9D9"/>
+              <w:bottom w:val="single" w:sz="6" w:color="D9D9D9"/>
+              <w:right w:val="single" w:sz="6" w:color="D9D9D9"/>
+            </w:tcBorders>
+            <w:vAlign w:val="center"/>
+          </w:tcPr>
+          <w:p>
+            <w:pPr>
+              <w:spacing w:after="0"/>
+              <w:jc w:val="center"/>
+            </w:pPr>
+            <w:r/>
+            <w:r>
+              <w:rPr>
+                <w:rFonts w:ascii="Aptos" w:hAnsi="Aptos"/>
+                <w:b/>
+                <w:color w:val="FFFFFF"/>
+                <w:sz w:val="16"/>
+              </w:rPr>
+              <w:t>Stage</w:t>
+            </w:r>
+          </w:p>
+        </w:tc>
+        <w:tc>
+          <w:tcPr>
+            <w:tcW w:type="dxa" w:w="7632"/>
+            <w:shd w:fill="17365D"/>
+            <w:tcBorders>
+              <w:top w:val="single" w:sz="6" w:color="D9D9D9"/>
+              <w:left w:val="single" w:sz="6" w:color="D9D9D9"/>
+              <w:bottom w:val="single" w:sz="6" w:color="D9D9D9"/>
+              <w:right w:val="single" w:sz="6" w:color="D9D9D9"/>
+            </w:tcBorders>
+            <w:vAlign w:val="center"/>
+          </w:tcPr>
+          <w:p>
+            <w:pPr>
+              <w:spacing w:after="0"/>
+              <w:jc w:val="center"/>
+            </w:pPr>
+            <w:r/>
+            <w:r>
+              <w:rPr>
+                <w:rFonts w:ascii="Aptos" w:hAnsi="Aptos"/>
+                <w:b/>
+                <w:color w:val="FFFFFF"/>
+                <w:sz w:val="16"/>
+              </w:rPr>
+              <w:t>Control</w:t>
+            </w:r>
+          </w:p>
+        </w:tc>
+      </w:tr>
+      <w:tr>
+        <w:tc>
+          <w:tcPr>
+            <w:tcW w:type="dxa" w:w="1728"/>
+            <w:shd w:fill="FFFFFF"/>
+            <w:tcBorders>
+              <w:top w:val="single" w:sz="6" w:color="D9D9D9"/>
+              <w:left w:val="single" w:sz="6" w:color="D9D9D9"/>
+              <w:bottom w:val="single" w:sz="6" w:color="D9D9D9"/>
+              <w:right w:val="single" w:sz="6" w:color="D9D9D9"/>
+            </w:tcBorders>
+            <w:vAlign w:val="center"/>
+          </w:tcPr>
+          <w:p>
+            <w:pPr>
+              <w:spacing w:after="0"/>
+              <w:jc w:val="left"/>
+            </w:pPr>
+            <w:r/>
+            <w:r>
+              <w:rPr>
+                <w:rFonts w:ascii="Aptos" w:hAnsi="Aptos"/>
+                <w:b w:val="0"/>
+                <w:color w:val="000000"/>
+                <w:sz w:val="16"/>
+              </w:rPr>
+              <w:t>Acquire</w:t>
+            </w:r>
+          </w:p>
+        </w:tc>
+        <w:tc>
+          <w:tcPr>
+            <w:tcW w:type="dxa" w:w="7632"/>
+            <w:shd w:fill="FFFFFF"/>
+            <w:tcBorders>
+              <w:top w:val="single" w:sz="6" w:color="D9D9D9"/>
+              <w:left w:val="single" w:sz="6" w:color="D9D9D9"/>
+              <w:bottom w:val="single" w:sz="6" w:color="D9D9D9"/>
+              <w:right w:val="single" w:sz="6" w:color="D9D9D9"/>
+            </w:tcBorders>
+            <w:vAlign w:val="center"/>
+          </w:tcPr>
+          <w:p>
+            <w:pPr>
+              <w:spacing w:after="0"/>
+              <w:jc w:val="left"/>
+            </w:pPr>
+            <w:r/>
+            <w:r>
+              <w:rPr>
+                <w:rFonts w:ascii="Aptos" w:hAnsi="Aptos"/>
+                <w:b w:val="0"/>
+                <w:color w:val="000000"/>
+                <w:sz w:val="16"/>
+              </w:rPr>
+              <w:t>Request each public feed independently with timeouts and source-specific field mappings.</w:t>
+            </w:r>
+          </w:p>
+        </w:tc>
+      </w:tr>
+      <w:tr>
+        <w:tc>
+          <w:tcPr>
+            <w:tcW w:type="dxa" w:w="1728"/>
+            <w:shd w:fill="F4F7FA"/>
+            <w:tcBorders>
+              <w:top w:val="single" w:sz="6" w:color="D9D9D9"/>
+              <w:left w:val="single" w:sz="6" w:color="D9D9D9"/>
+              <w:bottom w:val="single" w:sz="6" w:color="D9D9D9"/>
+              <w:right w:val="single" w:sz="6" w:color="D9D9D9"/>
+            </w:tcBorders>
+            <w:vAlign w:val="center"/>
+          </w:tcPr>
+          <w:p>
+            <w:pPr>
+              <w:spacing w:after="0"/>
+              <w:jc w:val="left"/>
+            </w:pPr>
+            <w:r/>
+            <w:r>
+              <w:rPr>
+                <w:rFonts w:ascii="Aptos" w:hAnsi="Aptos"/>
+                <w:b w:val="0"/>
+                <w:color w:val="000000"/>
+                <w:sz w:val="16"/>
+              </w:rPr>
+              <w:t>Normalize</w:t>
+            </w:r>
+          </w:p>
+        </w:tc>
+        <w:tc>
+          <w:tcPr>
+            <w:tcW w:type="dxa" w:w="7632"/>
+            <w:shd w:fill="F4F7FA"/>
+            <w:tcBorders>
+              <w:top w:val="single" w:sz="6" w:color="D9D9D9"/>
+              <w:left w:val="single" w:sz="6" w:color="D9D9D9"/>
+              <w:bottom w:val="single" w:sz="6" w:color="D9D9D9"/>
+              <w:right w:val="single" w:sz="6" w:color="D9D9D9"/>
+            </w:tcBorders>
+            <w:vAlign w:val="center"/>
+          </w:tcPr>
+          <w:p>
+            <w:pPr>
+              <w:spacing w:after="0"/>
+              <w:jc w:val="left"/>
+            </w:pPr>
+            <w:r/>
+            <w:r>
+              <w:rPr>
+                <w:rFonts w:ascii="Aptos" w:hAnsi="Aptos"/>
+                <w:b w:val="0"/>
+                <w:color w:val="000000"/>
+                <w:sz w:val="16"/>
+              </w:rPr>
+              <w:t>Convert HTML descriptions to text and standardize identifiers, dates, location, work type, and canonical URLs.</w:t>
+            </w:r>
+          </w:p>
+        </w:tc>
+      </w:tr>
+      <w:tr>
+        <w:tc>
+          <w:tcPr>
+            <w:tcW w:type="dxa" w:w="1728"/>
+            <w:shd w:fill="FFFFFF"/>
+            <w:tcBorders>
+              <w:top w:val="single" w:sz="6" w:color="D9D9D9"/>
+              <w:left w:val="single" w:sz="6" w:color="D9D9D9"/>
+              <w:bottom w:val="single" w:sz="6" w:color="D9D9D9"/>
+              <w:right w:val="single" w:sz="6" w:color="D9D9D9"/>
+            </w:tcBorders>
+            <w:vAlign w:val="center"/>
+          </w:tcPr>
+          <w:p>
+            <w:pPr>
+              <w:spacing w:after="0"/>
+              <w:jc w:val="left"/>
+            </w:pPr>
+            <w:r/>
+            <w:r>
+              <w:rPr>
+                <w:rFonts w:ascii="Aptos" w:hAnsi="Aptos"/>
+                <w:b w:val="0"/>
+                <w:color w:val="000000"/>
+                <w:sz w:val="16"/>
+              </w:rPr>
+              <w:t>Qualify</w:t>
+            </w:r>
+          </w:p>
+        </w:tc>
+        <w:tc>
+          <w:tcPr>
+            <w:tcW w:type="dxa" w:w="7632"/>
+            <w:shd w:fill="FFFFFF"/>
+            <w:tcBorders>
+              <w:top w:val="single" w:sz="6" w:color="D9D9D9"/>
+              <w:left w:val="single" w:sz="6" w:color="D9D9D9"/>
+              <w:bottom w:val="single" w:sz="6" w:color="D9D9D9"/>
+              <w:right w:val="single" w:sz="6" w:color="D9D9D9"/>
+            </w:tcBorders>
+            <w:vAlign w:val="center"/>
+          </w:tcPr>
+          <w:p>
+            <w:pPr>
+              <w:spacing w:after="0"/>
+              <w:jc w:val="left"/>
+            </w:pPr>
+            <w:r/>
+            <w:r>
+              <w:rPr>
+                <w:rFonts w:ascii="Aptos" w:hAnsi="Aptos"/>
+                <w:b w:val="0"/>
+                <w:color w:val="000000"/>
+                <w:sz w:val="16"/>
+              </w:rPr>
+              <w:t>Require a substantive description and a title phrase mapped to a documented degree role family.</w:t>
+            </w:r>
+          </w:p>
+        </w:tc>
+      </w:tr>
+      <w:tr>
+        <w:tc>
+          <w:tcPr>
+            <w:tcW w:type="dxa" w:w="1728"/>
+            <w:shd w:fill="F4F7FA"/>
+            <w:tcBorders>
+              <w:top w:val="single" w:sz="6" w:color="D9D9D9"/>
+              <w:left w:val="single" w:sz="6" w:color="D9D9D9"/>
+              <w:bottom w:val="single" w:sz="6" w:color="D9D9D9"/>
+              <w:right w:val="single" w:sz="6" w:color="D9D9D9"/>
+            </w:tcBorders>
+            <w:vAlign w:val="center"/>
+          </w:tcPr>
+          <w:p>
+            <w:pPr>
+              <w:spacing w:after="0"/>
+              <w:jc w:val="left"/>
+            </w:pPr>
+            <w:r/>
+            <w:r>
+              <w:rPr>
+                <w:rFonts w:ascii="Aptos" w:hAnsi="Aptos"/>
+                <w:b w:val="0"/>
+                <w:color w:val="000000"/>
+                <w:sz w:val="16"/>
+              </w:rPr>
+              <w:t>Extract</w:t>
+            </w:r>
+          </w:p>
+        </w:tc>
+        <w:tc>
+          <w:tcPr>
+            <w:tcW w:type="dxa" w:w="7632"/>
+            <w:shd w:fill="F4F7FA"/>
+            <w:tcBorders>
+              <w:top w:val="single" w:sz="6" w:color="D9D9D9"/>
+              <w:left w:val="single" w:sz="6" w:color="D9D9D9"/>
+              <w:bottom w:val="single" w:sz="6" w:color="D9D9D9"/>
+              <w:right w:val="single" w:sz="6" w:color="D9D9D9"/>
+            </w:tcBorders>
+            <w:vAlign w:val="center"/>
+          </w:tcPr>
+          <w:p>
+            <w:pPr>
+              <w:spacing w:after="0"/>
+              <w:jc w:val="left"/>
+            </w:pPr>
+            <w:r/>
+            <w:r>
+              <w:rPr>
+                <w:rFonts w:ascii="Aptos" w:hAnsi="Aptos"/>
+                <w:b w:val="0"/>
+                <w:color w:val="000000"/>
+                <w:sz w:val="16"/>
+              </w:rPr>
+              <w:t>Match maintained skill patterns against description text; never infer a skill solely from the title.</w:t>
+            </w:r>
+          </w:p>
+        </w:tc>
+      </w:tr>
+      <w:tr>
+        <w:tc>
+          <w:tcPr>
+            <w:tcW w:type="dxa" w:w="1728"/>
+            <w:shd w:fill="FFFFFF"/>
+            <w:tcBorders>
+              <w:top w:val="single" w:sz="6" w:color="D9D9D9"/>
+              <w:left w:val="single" w:sz="6" w:color="D9D9D9"/>
+              <w:bottom w:val="single" w:sz="6" w:color="D9D9D9"/>
+              <w:right w:val="single" w:sz="6" w:color="D9D9D9"/>
+            </w:tcBorders>
+            <w:vAlign w:val="center"/>
+          </w:tcPr>
+          <w:p>
+            <w:pPr>
+              <w:spacing w:after="0"/>
+              <w:jc w:val="left"/>
+            </w:pPr>
+            <w:r/>
+            <w:r>
+              <w:rPr>
+                <w:rFonts w:ascii="Aptos" w:hAnsi="Aptos"/>
+                <w:b w:val="0"/>
+                <w:color w:val="000000"/>
+                <w:sz w:val="16"/>
+              </w:rPr>
+              <w:t>Deduplicate</w:t>
+            </w:r>
+          </w:p>
+        </w:tc>
+        <w:tc>
+          <w:tcPr>
+            <w:tcW w:type="dxa" w:w="7632"/>
+            <w:shd w:fill="FFFFFF"/>
+            <w:tcBorders>
+              <w:top w:val="single" w:sz="6" w:color="D9D9D9"/>
+              <w:left w:val="single" w:sz="6" w:color="D9D9D9"/>
+              <w:bottom w:val="single" w:sz="6" w:color="D9D9D9"/>
+              <w:right w:val="single" w:sz="6" w:color="D9D9D9"/>
+            </w:tcBorders>
+            <w:vAlign w:val="center"/>
+          </w:tcPr>
+          <w:p>
+            <w:pPr>
+              <w:spacing w:after="0"/>
+              <w:jc w:val="left"/>
+            </w:pPr>
+            <w:r/>
+            <w:r>
+              <w:rPr>
+                <w:rFonts w:ascii="Aptos" w:hAnsi="Aptos"/>
+                <w:b w:val="0"/>
+                <w:color w:val="000000"/>
+                <w:sz w:val="16"/>
+              </w:rPr>
+              <w:t>Use the source plus external identifier as the stable key so repeated collection updates rather than duplicates.</w:t>
+            </w:r>
+          </w:p>
+        </w:tc>
+      </w:tr>
+      <w:tr>
+        <w:tc>
+          <w:tcPr>
+            <w:tcW w:type="dxa" w:w="1728"/>
+            <w:shd w:fill="F4F7FA"/>
+            <w:tcBorders>
+              <w:top w:val="single" w:sz="6" w:color="D9D9D9"/>
+              <w:left w:val="single" w:sz="6" w:color="D9D9D9"/>
+              <w:bottom w:val="single" w:sz="6" w:color="D9D9D9"/>
+              <w:right w:val="single" w:sz="6" w:color="D9D9D9"/>
+            </w:tcBorders>
+            <w:vAlign w:val="center"/>
+          </w:tcPr>
+          <w:p>
+            <w:pPr>
+              <w:spacing w:after="0"/>
+              <w:jc w:val="left"/>
+            </w:pPr>
+            <w:r/>
+            <w:r>
+              <w:rPr>
+                <w:rFonts w:ascii="Aptos" w:hAnsi="Aptos"/>
+                <w:b w:val="0"/>
+                <w:color w:val="000000"/>
+                <w:sz w:val="16"/>
+              </w:rPr>
+              <w:t>Attribute</w:t>
+            </w:r>
+          </w:p>
+        </w:tc>
+        <w:tc>
+          <w:tcPr>
+            <w:tcW w:type="dxa" w:w="7632"/>
+            <w:shd w:fill="F4F7FA"/>
+            <w:tcBorders>
+              <w:top w:val="single" w:sz="6" w:color="D9D9D9"/>
+              <w:left w:val="single" w:sz="6" w:color="D9D9D9"/>
+              <w:bottom w:val="single" w:sz="6" w:color="D9D9D9"/>
+              <w:right w:val="single" w:sz="6" w:color="D9D9D9"/>
+            </w:tcBorders>
+            <w:vAlign w:val="center"/>
+          </w:tcPr>
+          <w:p>
+            <w:pPr>
+              <w:spacing w:after="0"/>
+              <w:jc w:val="left"/>
+            </w:pPr>
+            <w:r/>
+            <w:r>
+              <w:rPr>
+                <w:rFonts w:ascii="Aptos" w:hAnsi="Aptos"/>
+                <w:b w:val="0"/>
+                <w:color w:val="000000"/>
+                <w:sz w:val="16"/>
+              </w:rPr>
+              <w:t>Retain the source name and canonical listing URL in the database, interface, and exported report.</w:t>
+            </w:r>
+          </w:p>
+        </w:tc>
+      </w:tr>
+    </w:tbl>
+    <w:p>
+      <w:pPr>
+        <w:spacing w:after="0"/>
+      </w:pPr>
+    </w:p>
+    <w:p>
+      <w:r>
+        <w:t>A zero in the source table means that the feed was configured but produced no degree-qualified listing in this collection. It should not be interpreted as proof that the source never carries relevant roles.</w:t>
+      </w:r>
+    </w:p>
+    <w:p>
+      <w:r>
+        <w:br w:type="page"/>
+      </w:r>
+    </w:p>
+    <w:p>
+      <w:pPr>
         <w:pStyle w:val="Heading1"/>
       </w:pPr>
       <w:r>
@@ -4666,7 +5181,491 @@
         <w:pStyle w:val="Heading2"/>
       </w:pPr>
       <w:r>
-        <w:t>Recommended Next Actions</w:t>
+        <w:t>Evidence Rubric</w:t>
+      </w:r>
+    </w:p>
+    <w:tbl>
+      <w:tblPr>
+        <w:tblW w:type="auto" w:w="0"/>
+        <w:jc w:val="center"/>
+        <w:tblLayout w:type="fixed"/>
+        <w:tblLook w:firstColumn="1" w:firstRow="1" w:lastColumn="0" w:lastRow="0" w:noHBand="0" w:noVBand="1" w:val="04A0"/>
+      </w:tblPr>
+      <w:tblGrid>
+        <w:gridCol w:w="3331"/>
+        <w:gridCol w:w="3331"/>
+        <w:gridCol w:w="3331"/>
+      </w:tblGrid>
+      <w:tr>
+        <w:tc>
+          <w:tcPr>
+            <w:tcW w:type="dxa" w:w="1728"/>
+            <w:shd w:fill="17365D"/>
+            <w:tcBorders>
+              <w:top w:val="single" w:sz="6" w:color="D9D9D9"/>
+              <w:left w:val="single" w:sz="6" w:color="D9D9D9"/>
+              <w:bottom w:val="single" w:sz="6" w:color="D9D9D9"/>
+              <w:right w:val="single" w:sz="6" w:color="D9D9D9"/>
+            </w:tcBorders>
+            <w:vAlign w:val="center"/>
+          </w:tcPr>
+          <w:p>
+            <w:pPr>
+              <w:spacing w:after="0"/>
+              <w:jc w:val="center"/>
+            </w:pPr>
+            <w:r/>
+            <w:r>
+              <w:rPr>
+                <w:rFonts w:ascii="Aptos" w:hAnsi="Aptos"/>
+                <w:b/>
+                <w:color w:val="FFFFFF"/>
+                <w:sz w:val="16"/>
+              </w:rPr>
+              <w:t>Status</w:t>
+            </w:r>
+          </w:p>
+        </w:tc>
+        <w:tc>
+          <w:tcPr>
+            <w:tcW w:type="dxa" w:w="1008"/>
+            <w:shd w:fill="17365D"/>
+            <w:tcBorders>
+              <w:top w:val="single" w:sz="6" w:color="D9D9D9"/>
+              <w:left w:val="single" w:sz="6" w:color="D9D9D9"/>
+              <w:bottom w:val="single" w:sz="6" w:color="D9D9D9"/>
+              <w:right w:val="single" w:sz="6" w:color="D9D9D9"/>
+            </w:tcBorders>
+            <w:vAlign w:val="center"/>
+          </w:tcPr>
+          <w:p>
+            <w:pPr>
+              <w:spacing w:after="0"/>
+              <w:jc w:val="center"/>
+            </w:pPr>
+            <w:r/>
+            <w:r>
+              <w:rPr>
+                <w:rFonts w:ascii="Aptos" w:hAnsi="Aptos"/>
+                <w:b/>
+                <w:color w:val="FFFFFF"/>
+                <w:sz w:val="16"/>
+              </w:rPr>
+              <w:t>Score</w:t>
+            </w:r>
+          </w:p>
+        </w:tc>
+        <w:tc>
+          <w:tcPr>
+            <w:tcW w:type="dxa" w:w="6624"/>
+            <w:shd w:fill="17365D"/>
+            <w:tcBorders>
+              <w:top w:val="single" w:sz="6" w:color="D9D9D9"/>
+              <w:left w:val="single" w:sz="6" w:color="D9D9D9"/>
+              <w:bottom w:val="single" w:sz="6" w:color="D9D9D9"/>
+              <w:right w:val="single" w:sz="6" w:color="D9D9D9"/>
+            </w:tcBorders>
+            <w:vAlign w:val="center"/>
+          </w:tcPr>
+          <w:p>
+            <w:pPr>
+              <w:spacing w:after="0"/>
+              <w:jc w:val="center"/>
+            </w:pPr>
+            <w:r/>
+            <w:r>
+              <w:rPr>
+                <w:rFonts w:ascii="Aptos" w:hAnsi="Aptos"/>
+                <w:b/>
+                <w:color w:val="FFFFFF"/>
+                <w:sz w:val="16"/>
+              </w:rPr>
+              <w:t>Required evidence</w:t>
+            </w:r>
+          </w:p>
+        </w:tc>
+      </w:tr>
+      <w:tr>
+        <w:tc>
+          <w:tcPr>
+            <w:tcW w:type="dxa" w:w="1728"/>
+            <w:shd w:fill="FFFFFF"/>
+            <w:tcBorders>
+              <w:top w:val="single" w:sz="6" w:color="D9D9D9"/>
+              <w:left w:val="single" w:sz="6" w:color="D9D9D9"/>
+              <w:bottom w:val="single" w:sz="6" w:color="D9D9D9"/>
+              <w:right w:val="single" w:sz="6" w:color="D9D9D9"/>
+            </w:tcBorders>
+            <w:vAlign w:val="center"/>
+          </w:tcPr>
+          <w:p>
+            <w:pPr>
+              <w:spacing w:after="0"/>
+              <w:jc w:val="left"/>
+            </w:pPr>
+            <w:r/>
+            <w:r>
+              <w:rPr>
+                <w:rFonts w:ascii="Aptos" w:hAnsi="Aptos"/>
+                <w:b w:val="0"/>
+                <w:color w:val="000000"/>
+                <w:sz w:val="16"/>
+              </w:rPr>
+              <w:t>Covered</w:t>
+            </w:r>
+          </w:p>
+        </w:tc>
+        <w:tc>
+          <w:tcPr>
+            <w:tcW w:type="dxa" w:w="1008"/>
+            <w:shd w:fill="FFFFFF"/>
+            <w:tcBorders>
+              <w:top w:val="single" w:sz="6" w:color="D9D9D9"/>
+              <w:left w:val="single" w:sz="6" w:color="D9D9D9"/>
+              <w:bottom w:val="single" w:sz="6" w:color="D9D9D9"/>
+              <w:right w:val="single" w:sz="6" w:color="D9D9D9"/>
+            </w:tcBorders>
+            <w:vAlign w:val="center"/>
+          </w:tcPr>
+          <w:p>
+            <w:pPr>
+              <w:spacing w:after="0"/>
+              <w:jc w:val="center"/>
+            </w:pPr>
+            <w:r/>
+            <w:r>
+              <w:rPr>
+                <w:rFonts w:ascii="Aptos" w:hAnsi="Aptos"/>
+                <w:b w:val="0"/>
+                <w:color w:val="000000"/>
+                <w:sz w:val="16"/>
+              </w:rPr>
+              <w:t>1.0</w:t>
+            </w:r>
+          </w:p>
+        </w:tc>
+        <w:tc>
+          <w:tcPr>
+            <w:tcW w:type="dxa" w:w="6624"/>
+            <w:shd w:fill="FFFFFF"/>
+            <w:tcBorders>
+              <w:top w:val="single" w:sz="6" w:color="D9D9D9"/>
+              <w:left w:val="single" w:sz="6" w:color="D9D9D9"/>
+              <w:bottom w:val="single" w:sz="6" w:color="D9D9D9"/>
+              <w:right w:val="single" w:sz="6" w:color="D9D9D9"/>
+            </w:tcBorders>
+            <w:vAlign w:val="center"/>
+          </w:tcPr>
+          <w:p>
+            <w:pPr>
+              <w:spacing w:after="0"/>
+              <w:jc w:val="left"/>
+            </w:pPr>
+            <w:r/>
+            <w:r>
+              <w:rPr>
+                <w:rFonts w:ascii="Aptos" w:hAnsi="Aptos"/>
+                <w:b w:val="0"/>
+                <w:color w:val="000000"/>
+                <w:sz w:val="16"/>
+              </w:rPr>
+              <w:t>An explicit learning outcome or assessed assignment requires the student to apply the skill.</w:t>
+            </w:r>
+          </w:p>
+        </w:tc>
+      </w:tr>
+      <w:tr>
+        <w:tc>
+          <w:tcPr>
+            <w:tcW w:type="dxa" w:w="1728"/>
+            <w:shd w:fill="F4F7FA"/>
+            <w:tcBorders>
+              <w:top w:val="single" w:sz="6" w:color="D9D9D9"/>
+              <w:left w:val="single" w:sz="6" w:color="D9D9D9"/>
+              <w:bottom w:val="single" w:sz="6" w:color="D9D9D9"/>
+              <w:right w:val="single" w:sz="6" w:color="D9D9D9"/>
+            </w:tcBorders>
+            <w:vAlign w:val="center"/>
+          </w:tcPr>
+          <w:p>
+            <w:pPr>
+              <w:spacing w:after="0"/>
+              <w:jc w:val="left"/>
+            </w:pPr>
+            <w:r/>
+            <w:r>
+              <w:rPr>
+                <w:rFonts w:ascii="Aptos" w:hAnsi="Aptos"/>
+                <w:b w:val="0"/>
+                <w:color w:val="000000"/>
+                <w:sz w:val="16"/>
+              </w:rPr>
+              <w:t>Partial</w:t>
+            </w:r>
+          </w:p>
+        </w:tc>
+        <w:tc>
+          <w:tcPr>
+            <w:tcW w:type="dxa" w:w="1008"/>
+            <w:shd w:fill="F4F7FA"/>
+            <w:tcBorders>
+              <w:top w:val="single" w:sz="6" w:color="D9D9D9"/>
+              <w:left w:val="single" w:sz="6" w:color="D9D9D9"/>
+              <w:bottom w:val="single" w:sz="6" w:color="D9D9D9"/>
+              <w:right w:val="single" w:sz="6" w:color="D9D9D9"/>
+            </w:tcBorders>
+            <w:vAlign w:val="center"/>
+          </w:tcPr>
+          <w:p>
+            <w:pPr>
+              <w:spacing w:after="0"/>
+              <w:jc w:val="center"/>
+            </w:pPr>
+            <w:r/>
+            <w:r>
+              <w:rPr>
+                <w:rFonts w:ascii="Aptos" w:hAnsi="Aptos"/>
+                <w:b w:val="0"/>
+                <w:color w:val="000000"/>
+                <w:sz w:val="16"/>
+              </w:rPr>
+              <w:t>0.5</w:t>
+            </w:r>
+          </w:p>
+        </w:tc>
+        <w:tc>
+          <w:tcPr>
+            <w:tcW w:type="dxa" w:w="6624"/>
+            <w:shd w:fill="F4F7FA"/>
+            <w:tcBorders>
+              <w:top w:val="single" w:sz="6" w:color="D9D9D9"/>
+              <w:left w:val="single" w:sz="6" w:color="D9D9D9"/>
+              <w:bottom w:val="single" w:sz="6" w:color="D9D9D9"/>
+              <w:right w:val="single" w:sz="6" w:color="D9D9D9"/>
+            </w:tcBorders>
+            <w:vAlign w:val="center"/>
+          </w:tcPr>
+          <w:p>
+            <w:pPr>
+              <w:spacing w:after="0"/>
+              <w:jc w:val="left"/>
+            </w:pPr>
+            <w:r/>
+            <w:r>
+              <w:rPr>
+                <w:rFonts w:ascii="Aptos" w:hAnsi="Aptos"/>
+                <w:b w:val="0"/>
+                <w:color w:val="000000"/>
+                <w:sz w:val="16"/>
+              </w:rPr>
+              <w:t>The skill appears in topics or readings, but assessed application is limited or indirect.</w:t>
+            </w:r>
+          </w:p>
+        </w:tc>
+      </w:tr>
+      <w:tr>
+        <w:tc>
+          <w:tcPr>
+            <w:tcW w:type="dxa" w:w="1728"/>
+            <w:shd w:fill="FFFFFF"/>
+            <w:tcBorders>
+              <w:top w:val="single" w:sz="6" w:color="D9D9D9"/>
+              <w:left w:val="single" w:sz="6" w:color="D9D9D9"/>
+              <w:bottom w:val="single" w:sz="6" w:color="D9D9D9"/>
+              <w:right w:val="single" w:sz="6" w:color="D9D9D9"/>
+            </w:tcBorders>
+            <w:vAlign w:val="center"/>
+          </w:tcPr>
+          <w:p>
+            <w:pPr>
+              <w:spacing w:after="0"/>
+              <w:jc w:val="left"/>
+            </w:pPr>
+            <w:r/>
+            <w:r>
+              <w:rPr>
+                <w:rFonts w:ascii="Aptos" w:hAnsi="Aptos"/>
+                <w:b w:val="0"/>
+                <w:color w:val="000000"/>
+                <w:sz w:val="16"/>
+              </w:rPr>
+              <w:t>Missing</w:t>
+            </w:r>
+          </w:p>
+        </w:tc>
+        <w:tc>
+          <w:tcPr>
+            <w:tcW w:type="dxa" w:w="1008"/>
+            <w:shd w:fill="FFFFFF"/>
+            <w:tcBorders>
+              <w:top w:val="single" w:sz="6" w:color="D9D9D9"/>
+              <w:left w:val="single" w:sz="6" w:color="D9D9D9"/>
+              <w:bottom w:val="single" w:sz="6" w:color="D9D9D9"/>
+              <w:right w:val="single" w:sz="6" w:color="D9D9D9"/>
+            </w:tcBorders>
+            <w:vAlign w:val="center"/>
+          </w:tcPr>
+          <w:p>
+            <w:pPr>
+              <w:spacing w:after="0"/>
+              <w:jc w:val="center"/>
+            </w:pPr>
+            <w:r/>
+            <w:r>
+              <w:rPr>
+                <w:rFonts w:ascii="Aptos" w:hAnsi="Aptos"/>
+                <w:b w:val="0"/>
+                <w:color w:val="000000"/>
+                <w:sz w:val="16"/>
+              </w:rPr>
+              <w:t>0.0</w:t>
+            </w:r>
+          </w:p>
+        </w:tc>
+        <w:tc>
+          <w:tcPr>
+            <w:tcW w:type="dxa" w:w="6624"/>
+            <w:shd w:fill="FFFFFF"/>
+            <w:tcBorders>
+              <w:top w:val="single" w:sz="6" w:color="D9D9D9"/>
+              <w:left w:val="single" w:sz="6" w:color="D9D9D9"/>
+              <w:bottom w:val="single" w:sz="6" w:color="D9D9D9"/>
+              <w:right w:val="single" w:sz="6" w:color="D9D9D9"/>
+            </w:tcBorders>
+            <w:vAlign w:val="center"/>
+          </w:tcPr>
+          <w:p>
+            <w:pPr>
+              <w:spacing w:after="0"/>
+              <w:jc w:val="left"/>
+            </w:pPr>
+            <w:r/>
+            <w:r>
+              <w:rPr>
+                <w:rFonts w:ascii="Aptos" w:hAnsi="Aptos"/>
+                <w:b w:val="0"/>
+                <w:color w:val="000000"/>
+                <w:sz w:val="16"/>
+              </w:rPr>
+              <w:t>No verified syllabus evidence addresses the skill.</w:t>
+            </w:r>
+          </w:p>
+        </w:tc>
+      </w:tr>
+      <w:tr>
+        <w:tc>
+          <w:tcPr>
+            <w:tcW w:type="dxa" w:w="1728"/>
+            <w:shd w:fill="F4F7FA"/>
+            <w:tcBorders>
+              <w:top w:val="single" w:sz="6" w:color="D9D9D9"/>
+              <w:left w:val="single" w:sz="6" w:color="D9D9D9"/>
+              <w:bottom w:val="single" w:sz="6" w:color="D9D9D9"/>
+              <w:right w:val="single" w:sz="6" w:color="D9D9D9"/>
+            </w:tcBorders>
+            <w:vAlign w:val="center"/>
+          </w:tcPr>
+          <w:p>
+            <w:pPr>
+              <w:spacing w:after="0"/>
+              <w:jc w:val="left"/>
+            </w:pPr>
+            <w:r/>
+            <w:r>
+              <w:rPr>
+                <w:rFonts w:ascii="Aptos" w:hAnsi="Aptos"/>
+                <w:b w:val="0"/>
+                <w:color w:val="000000"/>
+                <w:sz w:val="16"/>
+              </w:rPr>
+              <w:t>Not assessed</w:t>
+            </w:r>
+          </w:p>
+        </w:tc>
+        <w:tc>
+          <w:tcPr>
+            <w:tcW w:type="dxa" w:w="1008"/>
+            <w:shd w:fill="F4F7FA"/>
+            <w:tcBorders>
+              <w:top w:val="single" w:sz="6" w:color="D9D9D9"/>
+              <w:left w:val="single" w:sz="6" w:color="D9D9D9"/>
+              <w:bottom w:val="single" w:sz="6" w:color="D9D9D9"/>
+              <w:right w:val="single" w:sz="6" w:color="D9D9D9"/>
+            </w:tcBorders>
+            <w:vAlign w:val="center"/>
+          </w:tcPr>
+          <w:p>
+            <w:pPr>
+              <w:spacing w:after="0"/>
+              <w:jc w:val="center"/>
+            </w:pPr>
+            <w:r/>
+            <w:r>
+              <w:rPr>
+                <w:rFonts w:ascii="Aptos" w:hAnsi="Aptos"/>
+                <w:b w:val="0"/>
+                <w:color w:val="000000"/>
+                <w:sz w:val="16"/>
+              </w:rPr>
+              <w:t>—</w:t>
+            </w:r>
+          </w:p>
+        </w:tc>
+        <w:tc>
+          <w:tcPr>
+            <w:tcW w:type="dxa" w:w="6624"/>
+            <w:shd w:fill="F4F7FA"/>
+            <w:tcBorders>
+              <w:top w:val="single" w:sz="6" w:color="D9D9D9"/>
+              <w:left w:val="single" w:sz="6" w:color="D9D9D9"/>
+              <w:bottom w:val="single" w:sz="6" w:color="D9D9D9"/>
+              <w:right w:val="single" w:sz="6" w:color="D9D9D9"/>
+            </w:tcBorders>
+            <w:vAlign w:val="center"/>
+          </w:tcPr>
+          <w:p>
+            <w:pPr>
+              <w:spacing w:after="0"/>
+              <w:jc w:val="left"/>
+            </w:pPr>
+            <w:r/>
+            <w:r>
+              <w:rPr>
+                <w:rFonts w:ascii="Aptos" w:hAnsi="Aptos"/>
+                <w:b w:val="0"/>
+                <w:color w:val="000000"/>
+                <w:sz w:val="16"/>
+              </w:rPr>
+              <w:t>The necessary syllabus or course mapping has not been uploaded and verified.</w:t>
+            </w:r>
+          </w:p>
+        </w:tc>
+      </w:tr>
+    </w:tbl>
+    <w:p>
+      <w:pPr>
+        <w:spacing w:after="0"/>
+      </w:pPr>
+    </w:p>
+    <w:p>
+      <w:pPr>
+        <w:pStyle w:val="Heading2"/>
+      </w:pPr>
+      <w:r>
+        <w:t>Market-Weighted Calculation</w:t>
+      </w:r>
+    </w:p>
+    <w:p>
+      <w:r>
+        <w:t>For every skill, multiply its coverage value by the number of distinct job descriptions mentioning it. Sum those values and divide by the total job-mention weight. This prioritizes repeatedly observed demand while retaining a traceable result for each skill.</w:t>
+      </w:r>
+    </w:p>
+    <w:p>
+      <w:pPr>
+        <w:pStyle w:val="Heading2"/>
+      </w:pPr>
+      <w:r>
+        <w:t>Syllabus Evidence Required</w:t>
       </w:r>
     </w:p>
     <w:p>
@@ -4674,7 +5673,7 @@
         <w:pStyle w:val="ListBullet"/>
       </w:pPr>
       <w:r>
-        <w:t>Upload and verify the current degree syllabi, learning outcomes, weekly topics, tools, and assessed projects.</w:t>
+        <w:t>Course code, title, catalog description, and degree-program mapping.</w:t>
       </w:r>
     </w:p>
     <w:p>
@@ -4682,7 +5681,7 @@
         <w:pStyle w:val="ListBullet"/>
       </w:pPr>
       <w:r>
-        <w:t>Collect the same sources on a schedule so the report can show stable demand, emerging skills, and declining signals.</w:t>
+        <w:t>Learning outcomes, weekly topics, required tools, readings, and laboratory activities.</w:t>
       </w:r>
     </w:p>
     <w:p>
@@ -4690,7 +5689,7 @@
         <w:pStyle w:val="ListBullet"/>
       </w:pPr>
       <w:r>
-        <w:t>Add Dallas, Texas, and broader United States sources before using the results for local-market advising.</w:t>
+        <w:t>Assessments and projects showing what students must produce or demonstrate.</w:t>
       </w:r>
     </w:p>
     <w:p>
@@ -4698,7 +5697,1528 @@
         <w:pStyle w:val="ListBullet"/>
       </w:pPr>
       <w:r>
-        <w:t>Connect each student resume claim to course, project, internship, certification, or work evidence.</w:t>
+        <w:t>Faculty review of extracted topics before they are treated as authoritative coverage evidence.</w:t>
+      </w:r>
+    </w:p>
+    <w:p>
+      <w:r>
+        <w:br w:type="page"/>
+      </w:r>
+    </w:p>
+    <w:p>
+      <w:pPr>
+        <w:pStyle w:val="Heading1"/>
+      </w:pPr>
+      <w:r>
+        <w:t>Student Job-Readiness Framework</w:t>
+      </w:r>
+    </w:p>
+    <w:p>
+      <w:r>
+        <w:t>Curriculum alignment describes exposure and assessed learning. Student readiness requires additional evidence that the individual can apply those skills to relevant problems and communicate the result to an employer.</w:t>
+      </w:r>
+    </w:p>
+    <w:tbl>
+      <w:tblPr>
+        <w:tblW w:type="auto" w:w="0"/>
+        <w:jc w:val="center"/>
+        <w:tblLayout w:type="fixed"/>
+        <w:tblLook w:firstColumn="1" w:firstRow="1" w:lastColumn="0" w:lastRow="0" w:noHBand="0" w:noVBand="1" w:val="04A0"/>
+      </w:tblPr>
+      <w:tblGrid>
+        <w:gridCol w:w="3331"/>
+        <w:gridCol w:w="3331"/>
+        <w:gridCol w:w="3331"/>
+      </w:tblGrid>
+      <w:tr>
+        <w:tc>
+          <w:tcPr>
+            <w:tcW w:type="dxa" w:w="1512"/>
+            <w:shd w:fill="17365D"/>
+            <w:tcBorders>
+              <w:top w:val="single" w:sz="6" w:color="D9D9D9"/>
+              <w:left w:val="single" w:sz="6" w:color="D9D9D9"/>
+              <w:bottom w:val="single" w:sz="6" w:color="D9D9D9"/>
+              <w:right w:val="single" w:sz="6" w:color="D9D9D9"/>
+            </w:tcBorders>
+            <w:vAlign w:val="center"/>
+          </w:tcPr>
+          <w:p>
+            <w:pPr>
+              <w:spacing w:after="0"/>
+              <w:jc w:val="center"/>
+            </w:pPr>
+            <w:r/>
+            <w:r>
+              <w:rPr>
+                <w:rFonts w:ascii="Aptos" w:hAnsi="Aptos"/>
+                <w:b/>
+                <w:color w:val="FFFFFF"/>
+                <w:sz w:val="16"/>
+              </w:rPr>
+              <w:t>Evidence layer</w:t>
+            </w:r>
+          </w:p>
+        </w:tc>
+        <w:tc>
+          <w:tcPr>
+            <w:tcW w:type="dxa" w:w="3888"/>
+            <w:shd w:fill="17365D"/>
+            <w:tcBorders>
+              <w:top w:val="single" w:sz="6" w:color="D9D9D9"/>
+              <w:left w:val="single" w:sz="6" w:color="D9D9D9"/>
+              <w:bottom w:val="single" w:sz="6" w:color="D9D9D9"/>
+              <w:right w:val="single" w:sz="6" w:color="D9D9D9"/>
+            </w:tcBorders>
+            <w:vAlign w:val="center"/>
+          </w:tcPr>
+          <w:p>
+            <w:pPr>
+              <w:spacing w:after="0"/>
+              <w:jc w:val="center"/>
+            </w:pPr>
+            <w:r/>
+            <w:r>
+              <w:rPr>
+                <w:rFonts w:ascii="Aptos" w:hAnsi="Aptos"/>
+                <w:b/>
+                <w:color w:val="FFFFFF"/>
+                <w:sz w:val="16"/>
+              </w:rPr>
+              <w:t>Student evidence</w:t>
+            </w:r>
+          </w:p>
+        </w:tc>
+        <w:tc>
+          <w:tcPr>
+            <w:tcW w:type="dxa" w:w="3960"/>
+            <w:shd w:fill="17365D"/>
+            <w:tcBorders>
+              <w:top w:val="single" w:sz="6" w:color="D9D9D9"/>
+              <w:left w:val="single" w:sz="6" w:color="D9D9D9"/>
+              <w:bottom w:val="single" w:sz="6" w:color="D9D9D9"/>
+              <w:right w:val="single" w:sz="6" w:color="D9D9D9"/>
+            </w:tcBorders>
+            <w:vAlign w:val="center"/>
+          </w:tcPr>
+          <w:p>
+            <w:pPr>
+              <w:spacing w:after="0"/>
+              <w:jc w:val="center"/>
+            </w:pPr>
+            <w:r/>
+            <w:r>
+              <w:rPr>
+                <w:rFonts w:ascii="Aptos" w:hAnsi="Aptos"/>
+                <w:b/>
+                <w:color w:val="FFFFFF"/>
+                <w:sz w:val="16"/>
+              </w:rPr>
+              <w:t>System use</w:t>
+            </w:r>
+          </w:p>
+        </w:tc>
+      </w:tr>
+      <w:tr>
+        <w:tc>
+          <w:tcPr>
+            <w:tcW w:type="dxa" w:w="1512"/>
+            <w:shd w:fill="FFFFFF"/>
+            <w:tcBorders>
+              <w:top w:val="single" w:sz="6" w:color="D9D9D9"/>
+              <w:left w:val="single" w:sz="6" w:color="D9D9D9"/>
+              <w:bottom w:val="single" w:sz="6" w:color="D9D9D9"/>
+              <w:right w:val="single" w:sz="6" w:color="D9D9D9"/>
+            </w:tcBorders>
+            <w:vAlign w:val="center"/>
+          </w:tcPr>
+          <w:p>
+            <w:pPr>
+              <w:spacing w:after="0"/>
+              <w:jc w:val="left"/>
+            </w:pPr>
+            <w:r/>
+            <w:r>
+              <w:rPr>
+                <w:rFonts w:ascii="Aptos" w:hAnsi="Aptos"/>
+                <w:b w:val="0"/>
+                <w:color w:val="000000"/>
+                <w:sz w:val="16"/>
+              </w:rPr>
+              <w:t>Curriculum</w:t>
+            </w:r>
+          </w:p>
+        </w:tc>
+        <w:tc>
+          <w:tcPr>
+            <w:tcW w:type="dxa" w:w="3888"/>
+            <w:shd w:fill="FFFFFF"/>
+            <w:tcBorders>
+              <w:top w:val="single" w:sz="6" w:color="D9D9D9"/>
+              <w:left w:val="single" w:sz="6" w:color="D9D9D9"/>
+              <w:bottom w:val="single" w:sz="6" w:color="D9D9D9"/>
+              <w:right w:val="single" w:sz="6" w:color="D9D9D9"/>
+            </w:tcBorders>
+            <w:vAlign w:val="center"/>
+          </w:tcPr>
+          <w:p>
+            <w:pPr>
+              <w:spacing w:after="0"/>
+              <w:jc w:val="left"/>
+            </w:pPr>
+            <w:r/>
+            <w:r>
+              <w:rPr>
+                <w:rFonts w:ascii="Aptos" w:hAnsi="Aptos"/>
+                <w:b w:val="0"/>
+                <w:color w:val="000000"/>
+                <w:sz w:val="16"/>
+              </w:rPr>
+              <w:t>Completed courses, assessed work, and verified learning outcomes</w:t>
+            </w:r>
+          </w:p>
+        </w:tc>
+        <w:tc>
+          <w:tcPr>
+            <w:tcW w:type="dxa" w:w="3960"/>
+            <w:shd w:fill="FFFFFF"/>
+            <w:tcBorders>
+              <w:top w:val="single" w:sz="6" w:color="D9D9D9"/>
+              <w:left w:val="single" w:sz="6" w:color="D9D9D9"/>
+              <w:bottom w:val="single" w:sz="6" w:color="D9D9D9"/>
+              <w:right w:val="single" w:sz="6" w:color="D9D9D9"/>
+            </w:tcBorders>
+            <w:vAlign w:val="center"/>
+          </w:tcPr>
+          <w:p>
+            <w:pPr>
+              <w:spacing w:after="0"/>
+              <w:jc w:val="left"/>
+            </w:pPr>
+            <w:r/>
+            <w:r>
+              <w:rPr>
+                <w:rFonts w:ascii="Aptos" w:hAnsi="Aptos"/>
+                <w:b w:val="0"/>
+                <w:color w:val="000000"/>
+                <w:sz w:val="16"/>
+              </w:rPr>
+              <w:t>Shows where demanded skills are taught and practiced.</w:t>
+            </w:r>
+          </w:p>
+        </w:tc>
+      </w:tr>
+      <w:tr>
+        <w:tc>
+          <w:tcPr>
+            <w:tcW w:type="dxa" w:w="1512"/>
+            <w:shd w:fill="F4F7FA"/>
+            <w:tcBorders>
+              <w:top w:val="single" w:sz="6" w:color="D9D9D9"/>
+              <w:left w:val="single" w:sz="6" w:color="D9D9D9"/>
+              <w:bottom w:val="single" w:sz="6" w:color="D9D9D9"/>
+              <w:right w:val="single" w:sz="6" w:color="D9D9D9"/>
+            </w:tcBorders>
+            <w:vAlign w:val="center"/>
+          </w:tcPr>
+          <w:p>
+            <w:pPr>
+              <w:spacing w:after="0"/>
+              <w:jc w:val="left"/>
+            </w:pPr>
+            <w:r/>
+            <w:r>
+              <w:rPr>
+                <w:rFonts w:ascii="Aptos" w:hAnsi="Aptos"/>
+                <w:b w:val="0"/>
+                <w:color w:val="000000"/>
+                <w:sz w:val="16"/>
+              </w:rPr>
+              <w:t>Portfolio</w:t>
+            </w:r>
+          </w:p>
+        </w:tc>
+        <w:tc>
+          <w:tcPr>
+            <w:tcW w:type="dxa" w:w="3888"/>
+            <w:shd w:fill="F4F7FA"/>
+            <w:tcBorders>
+              <w:top w:val="single" w:sz="6" w:color="D9D9D9"/>
+              <w:left w:val="single" w:sz="6" w:color="D9D9D9"/>
+              <w:bottom w:val="single" w:sz="6" w:color="D9D9D9"/>
+              <w:right w:val="single" w:sz="6" w:color="D9D9D9"/>
+            </w:tcBorders>
+            <w:vAlign w:val="center"/>
+          </w:tcPr>
+          <w:p>
+            <w:pPr>
+              <w:spacing w:after="0"/>
+              <w:jc w:val="left"/>
+            </w:pPr>
+            <w:r/>
+            <w:r>
+              <w:rPr>
+                <w:rFonts w:ascii="Aptos" w:hAnsi="Aptos"/>
+                <w:b w:val="0"/>
+                <w:color w:val="000000"/>
+                <w:sz w:val="16"/>
+              </w:rPr>
+              <w:t>Projects, datasets, systems, dashboards, reports, and measurable outcomes</w:t>
+            </w:r>
+          </w:p>
+        </w:tc>
+        <w:tc>
+          <w:tcPr>
+            <w:tcW w:type="dxa" w:w="3960"/>
+            <w:shd w:fill="F4F7FA"/>
+            <w:tcBorders>
+              <w:top w:val="single" w:sz="6" w:color="D9D9D9"/>
+              <w:left w:val="single" w:sz="6" w:color="D9D9D9"/>
+              <w:bottom w:val="single" w:sz="6" w:color="D9D9D9"/>
+              <w:right w:val="single" w:sz="6" w:color="D9D9D9"/>
+            </w:tcBorders>
+            <w:vAlign w:val="center"/>
+          </w:tcPr>
+          <w:p>
+            <w:pPr>
+              <w:spacing w:after="0"/>
+              <w:jc w:val="left"/>
+            </w:pPr>
+            <w:r/>
+            <w:r>
+              <w:rPr>
+                <w:rFonts w:ascii="Aptos" w:hAnsi="Aptos"/>
+                <w:b w:val="0"/>
+                <w:color w:val="000000"/>
+                <w:sz w:val="16"/>
+              </w:rPr>
+              <w:t>Demonstrates applied ability beyond a keyword claim.</w:t>
+            </w:r>
+          </w:p>
+        </w:tc>
+      </w:tr>
+      <w:tr>
+        <w:tc>
+          <w:tcPr>
+            <w:tcW w:type="dxa" w:w="1512"/>
+            <w:shd w:fill="FFFFFF"/>
+            <w:tcBorders>
+              <w:top w:val="single" w:sz="6" w:color="D9D9D9"/>
+              <w:left w:val="single" w:sz="6" w:color="D9D9D9"/>
+              <w:bottom w:val="single" w:sz="6" w:color="D9D9D9"/>
+              <w:right w:val="single" w:sz="6" w:color="D9D9D9"/>
+            </w:tcBorders>
+            <w:vAlign w:val="center"/>
+          </w:tcPr>
+          <w:p>
+            <w:pPr>
+              <w:spacing w:after="0"/>
+              <w:jc w:val="left"/>
+            </w:pPr>
+            <w:r/>
+            <w:r>
+              <w:rPr>
+                <w:rFonts w:ascii="Aptos" w:hAnsi="Aptos"/>
+                <w:b w:val="0"/>
+                <w:color w:val="000000"/>
+                <w:sz w:val="16"/>
+              </w:rPr>
+              <w:t>Resume</w:t>
+            </w:r>
+          </w:p>
+        </w:tc>
+        <w:tc>
+          <w:tcPr>
+            <w:tcW w:type="dxa" w:w="3888"/>
+            <w:shd w:fill="FFFFFF"/>
+            <w:tcBorders>
+              <w:top w:val="single" w:sz="6" w:color="D9D9D9"/>
+              <w:left w:val="single" w:sz="6" w:color="D9D9D9"/>
+              <w:bottom w:val="single" w:sz="6" w:color="D9D9D9"/>
+              <w:right w:val="single" w:sz="6" w:color="D9D9D9"/>
+            </w:tcBorders>
+            <w:vAlign w:val="center"/>
+          </w:tcPr>
+          <w:p>
+            <w:pPr>
+              <w:spacing w:after="0"/>
+              <w:jc w:val="left"/>
+            </w:pPr>
+            <w:r/>
+            <w:r>
+              <w:rPr>
+                <w:rFonts w:ascii="Aptos" w:hAnsi="Aptos"/>
+                <w:b w:val="0"/>
+                <w:color w:val="000000"/>
+                <w:sz w:val="16"/>
+              </w:rPr>
+              <w:t>Degree, experience, projects, certifications, and quantified accomplishments</w:t>
+            </w:r>
+          </w:p>
+        </w:tc>
+        <w:tc>
+          <w:tcPr>
+            <w:tcW w:type="dxa" w:w="3960"/>
+            <w:shd w:fill="FFFFFF"/>
+            <w:tcBorders>
+              <w:top w:val="single" w:sz="6" w:color="D9D9D9"/>
+              <w:left w:val="single" w:sz="6" w:color="D9D9D9"/>
+              <w:bottom w:val="single" w:sz="6" w:color="D9D9D9"/>
+              <w:right w:val="single" w:sz="6" w:color="D9D9D9"/>
+            </w:tcBorders>
+            <w:vAlign w:val="center"/>
+          </w:tcPr>
+          <w:p>
+            <w:pPr>
+              <w:spacing w:after="0"/>
+              <w:jc w:val="left"/>
+            </w:pPr>
+            <w:r/>
+            <w:r>
+              <w:rPr>
+                <w:rFonts w:ascii="Aptos" w:hAnsi="Aptos"/>
+                <w:b w:val="0"/>
+                <w:color w:val="000000"/>
+                <w:sz w:val="16"/>
+              </w:rPr>
+              <w:t>Connects each claimed skill to supporting evidence.</w:t>
+            </w:r>
+          </w:p>
+        </w:tc>
+      </w:tr>
+      <w:tr>
+        <w:tc>
+          <w:tcPr>
+            <w:tcW w:type="dxa" w:w="1512"/>
+            <w:shd w:fill="F4F7FA"/>
+            <w:tcBorders>
+              <w:top w:val="single" w:sz="6" w:color="D9D9D9"/>
+              <w:left w:val="single" w:sz="6" w:color="D9D9D9"/>
+              <w:bottom w:val="single" w:sz="6" w:color="D9D9D9"/>
+              <w:right w:val="single" w:sz="6" w:color="D9D9D9"/>
+            </w:tcBorders>
+            <w:vAlign w:val="center"/>
+          </w:tcPr>
+          <w:p>
+            <w:pPr>
+              <w:spacing w:after="0"/>
+              <w:jc w:val="left"/>
+            </w:pPr>
+            <w:r/>
+            <w:r>
+              <w:rPr>
+                <w:rFonts w:ascii="Aptos" w:hAnsi="Aptos"/>
+                <w:b w:val="0"/>
+                <w:color w:val="000000"/>
+                <w:sz w:val="16"/>
+              </w:rPr>
+              <w:t>Role fit</w:t>
+            </w:r>
+          </w:p>
+        </w:tc>
+        <w:tc>
+          <w:tcPr>
+            <w:tcW w:type="dxa" w:w="3888"/>
+            <w:shd w:fill="F4F7FA"/>
+            <w:tcBorders>
+              <w:top w:val="single" w:sz="6" w:color="D9D9D9"/>
+              <w:left w:val="single" w:sz="6" w:color="D9D9D9"/>
+              <w:bottom w:val="single" w:sz="6" w:color="D9D9D9"/>
+              <w:right w:val="single" w:sz="6" w:color="D9D9D9"/>
+            </w:tcBorders>
+            <w:vAlign w:val="center"/>
+          </w:tcPr>
+          <w:p>
+            <w:pPr>
+              <w:spacing w:after="0"/>
+              <w:jc w:val="left"/>
+            </w:pPr>
+            <w:r/>
+            <w:r>
+              <w:rPr>
+                <w:rFonts w:ascii="Aptos" w:hAnsi="Aptos"/>
+                <w:b w:val="0"/>
+                <w:color w:val="000000"/>
+                <w:sz w:val="16"/>
+              </w:rPr>
+              <w:t>Target title, preferred industries, location, work authorization, and seniority</w:t>
+            </w:r>
+          </w:p>
+        </w:tc>
+        <w:tc>
+          <w:tcPr>
+            <w:tcW w:type="dxa" w:w="3960"/>
+            <w:shd w:fill="F4F7FA"/>
+            <w:tcBorders>
+              <w:top w:val="single" w:sz="6" w:color="D9D9D9"/>
+              <w:left w:val="single" w:sz="6" w:color="D9D9D9"/>
+              <w:bottom w:val="single" w:sz="6" w:color="D9D9D9"/>
+              <w:right w:val="single" w:sz="6" w:color="D9D9D9"/>
+            </w:tcBorders>
+            <w:vAlign w:val="center"/>
+          </w:tcPr>
+          <w:p>
+            <w:pPr>
+              <w:spacing w:after="0"/>
+              <w:jc w:val="left"/>
+            </w:pPr>
+            <w:r/>
+            <w:r>
+              <w:rPr>
+                <w:rFonts w:ascii="Aptos" w:hAnsi="Aptos"/>
+                <w:b w:val="0"/>
+                <w:color w:val="000000"/>
+                <w:sz w:val="16"/>
+              </w:rPr>
+              <w:t>Filters jobs that are plausible and relevant.</w:t>
+            </w:r>
+          </w:p>
+        </w:tc>
+      </w:tr>
+      <w:tr>
+        <w:tc>
+          <w:tcPr>
+            <w:tcW w:type="dxa" w:w="1512"/>
+            <w:shd w:fill="FFFFFF"/>
+            <w:tcBorders>
+              <w:top w:val="single" w:sz="6" w:color="D9D9D9"/>
+              <w:left w:val="single" w:sz="6" w:color="D9D9D9"/>
+              <w:bottom w:val="single" w:sz="6" w:color="D9D9D9"/>
+              <w:right w:val="single" w:sz="6" w:color="D9D9D9"/>
+            </w:tcBorders>
+            <w:vAlign w:val="center"/>
+          </w:tcPr>
+          <w:p>
+            <w:pPr>
+              <w:spacing w:after="0"/>
+              <w:jc w:val="left"/>
+            </w:pPr>
+            <w:r/>
+            <w:r>
+              <w:rPr>
+                <w:rFonts w:ascii="Aptos" w:hAnsi="Aptos"/>
+                <w:b w:val="0"/>
+                <w:color w:val="000000"/>
+                <w:sz w:val="16"/>
+              </w:rPr>
+              <w:t>Application</w:t>
+            </w:r>
+          </w:p>
+        </w:tc>
+        <w:tc>
+          <w:tcPr>
+            <w:tcW w:type="dxa" w:w="3888"/>
+            <w:shd w:fill="FFFFFF"/>
+            <w:tcBorders>
+              <w:top w:val="single" w:sz="6" w:color="D9D9D9"/>
+              <w:left w:val="single" w:sz="6" w:color="D9D9D9"/>
+              <w:bottom w:val="single" w:sz="6" w:color="D9D9D9"/>
+              <w:right w:val="single" w:sz="6" w:color="D9D9D9"/>
+            </w:tcBorders>
+            <w:vAlign w:val="center"/>
+          </w:tcPr>
+          <w:p>
+            <w:pPr>
+              <w:spacing w:after="0"/>
+              <w:jc w:val="left"/>
+            </w:pPr>
+            <w:r/>
+            <w:r>
+              <w:rPr>
+                <w:rFonts w:ascii="Aptos" w:hAnsi="Aptos"/>
+                <w:b w:val="0"/>
+                <w:color w:val="000000"/>
+                <w:sz w:val="16"/>
+              </w:rPr>
+              <w:t>Tailored resume, cover letter, interview examples, and networking activity</w:t>
+            </w:r>
+          </w:p>
+        </w:tc>
+        <w:tc>
+          <w:tcPr>
+            <w:tcW w:type="dxa" w:w="3960"/>
+            <w:shd w:fill="FFFFFF"/>
+            <w:tcBorders>
+              <w:top w:val="single" w:sz="6" w:color="D9D9D9"/>
+              <w:left w:val="single" w:sz="6" w:color="D9D9D9"/>
+              <w:bottom w:val="single" w:sz="6" w:color="D9D9D9"/>
+              <w:right w:val="single" w:sz="6" w:color="D9D9D9"/>
+            </w:tcBorders>
+            <w:vAlign w:val="center"/>
+          </w:tcPr>
+          <w:p>
+            <w:pPr>
+              <w:spacing w:after="0"/>
+              <w:jc w:val="left"/>
+            </w:pPr>
+            <w:r/>
+            <w:r>
+              <w:rPr>
+                <w:rFonts w:ascii="Aptos" w:hAnsi="Aptos"/>
+                <w:b w:val="0"/>
+                <w:color w:val="000000"/>
+                <w:sz w:val="16"/>
+              </w:rPr>
+              <w:t>Tracks preparation and execution for each opportunity.</w:t>
+            </w:r>
+          </w:p>
+        </w:tc>
+      </w:tr>
+    </w:tbl>
+    <w:p>
+      <w:pPr>
+        <w:spacing w:after="0"/>
+      </w:pPr>
+    </w:p>
+    <w:p>
+      <w:pPr>
+        <w:pStyle w:val="Heading2"/>
+      </w:pPr>
+      <w:r>
+        <w:t>Degree-Specific Portfolio Priorities</w:t>
+      </w:r>
+    </w:p>
+    <w:p>
+      <w:pPr>
+        <w:pStyle w:val="ListBullet"/>
+      </w:pPr>
+      <w:r>
+        <w:t>Complete a reproducible SQL and Python analysis using a realistic business dataset.</w:t>
+      </w:r>
+    </w:p>
+    <w:p>
+      <w:pPr>
+        <w:pStyle w:val="ListBullet"/>
+      </w:pPr>
+      <w:r>
+        <w:t>Build a decision-oriented dashboard and explain metric definitions, data quality, and limitations.</w:t>
+      </w:r>
+    </w:p>
+    <w:p>
+      <w:pPr>
+        <w:pStyle w:val="ListBullet"/>
+      </w:pPr>
+      <w:r>
+        <w:t>Frame an ambiguous business question, document assumptions, and present an actionable recommendation.</w:t>
+      </w:r>
+    </w:p>
+    <w:p>
+      <w:pPr>
+        <w:pStyle w:val="ListBullet"/>
+      </w:pPr>
+      <w:r>
+        <w:t>Show data preparation, statistical reasoning, validation, visualization, and stakeholder communication in one end-to-end project.</w:t>
+      </w:r>
+    </w:p>
+    <w:p>
+      <w:r>
+        <w:br w:type="page"/>
+      </w:r>
+    </w:p>
+    <w:p>
+      <w:pPr>
+        <w:pStyle w:val="Heading1"/>
+      </w:pPr>
+      <w:r>
+        <w:t>Implementation Roadmap</w:t>
+      </w:r>
+    </w:p>
+    <w:tbl>
+      <w:tblPr>
+        <w:tblW w:type="auto" w:w="0"/>
+        <w:jc w:val="center"/>
+        <w:tblLayout w:type="fixed"/>
+        <w:tblLook w:firstColumn="1" w:firstRow="1" w:lastColumn="0" w:lastRow="0" w:noHBand="0" w:noVBand="1" w:val="04A0"/>
+      </w:tblPr>
+      <w:tblGrid>
+        <w:gridCol w:w="2498"/>
+        <w:gridCol w:w="2498"/>
+        <w:gridCol w:w="2498"/>
+        <w:gridCol w:w="2498"/>
+      </w:tblGrid>
+      <w:tr>
+        <w:tc>
+          <w:tcPr>
+            <w:tcW w:type="dxa" w:w="1656"/>
+            <w:shd w:fill="17365D"/>
+            <w:tcBorders>
+              <w:top w:val="single" w:sz="6" w:color="D9D9D9"/>
+              <w:left w:val="single" w:sz="6" w:color="D9D9D9"/>
+              <w:bottom w:val="single" w:sz="6" w:color="D9D9D9"/>
+              <w:right w:val="single" w:sz="6" w:color="D9D9D9"/>
+            </w:tcBorders>
+            <w:vAlign w:val="center"/>
+          </w:tcPr>
+          <w:p>
+            <w:pPr>
+              <w:spacing w:after="0"/>
+              <w:jc w:val="center"/>
+            </w:pPr>
+            <w:r/>
+            <w:r>
+              <w:rPr>
+                <w:rFonts w:ascii="Aptos" w:hAnsi="Aptos"/>
+                <w:b/>
+                <w:color w:val="FFFFFF"/>
+                <w:sz w:val="16"/>
+              </w:rPr>
+              <w:t>Phase</w:t>
+            </w:r>
+          </w:p>
+        </w:tc>
+        <w:tc>
+          <w:tcPr>
+            <w:tcW w:type="dxa" w:w="1224"/>
+            <w:shd w:fill="17365D"/>
+            <w:tcBorders>
+              <w:top w:val="single" w:sz="6" w:color="D9D9D9"/>
+              <w:left w:val="single" w:sz="6" w:color="D9D9D9"/>
+              <w:bottom w:val="single" w:sz="6" w:color="D9D9D9"/>
+              <w:right w:val="single" w:sz="6" w:color="D9D9D9"/>
+            </w:tcBorders>
+            <w:vAlign w:val="center"/>
+          </w:tcPr>
+          <w:p>
+            <w:pPr>
+              <w:spacing w:after="0"/>
+              <w:jc w:val="center"/>
+            </w:pPr>
+            <w:r/>
+            <w:r>
+              <w:rPr>
+                <w:rFonts w:ascii="Aptos" w:hAnsi="Aptos"/>
+                <w:b/>
+                <w:color w:val="FFFFFF"/>
+                <w:sz w:val="16"/>
+              </w:rPr>
+              <w:t>Timing</w:t>
+            </w:r>
+          </w:p>
+        </w:tc>
+        <w:tc>
+          <w:tcPr>
+            <w:tcW w:type="dxa" w:w="4032"/>
+            <w:shd w:fill="17365D"/>
+            <w:tcBorders>
+              <w:top w:val="single" w:sz="6" w:color="D9D9D9"/>
+              <w:left w:val="single" w:sz="6" w:color="D9D9D9"/>
+              <w:bottom w:val="single" w:sz="6" w:color="D9D9D9"/>
+              <w:right w:val="single" w:sz="6" w:color="D9D9D9"/>
+            </w:tcBorders>
+            <w:vAlign w:val="center"/>
+          </w:tcPr>
+          <w:p>
+            <w:pPr>
+              <w:spacing w:after="0"/>
+              <w:jc w:val="center"/>
+            </w:pPr>
+            <w:r/>
+            <w:r>
+              <w:rPr>
+                <w:rFonts w:ascii="Aptos" w:hAnsi="Aptos"/>
+                <w:b/>
+                <w:color w:val="FFFFFF"/>
+                <w:sz w:val="16"/>
+              </w:rPr>
+              <w:t>Deliverables</w:t>
+            </w:r>
+          </w:p>
+        </w:tc>
+        <w:tc>
+          <w:tcPr>
+            <w:tcW w:type="dxa" w:w="2448"/>
+            <w:shd w:fill="17365D"/>
+            <w:tcBorders>
+              <w:top w:val="single" w:sz="6" w:color="D9D9D9"/>
+              <w:left w:val="single" w:sz="6" w:color="D9D9D9"/>
+              <w:bottom w:val="single" w:sz="6" w:color="D9D9D9"/>
+              <w:right w:val="single" w:sz="6" w:color="D9D9D9"/>
+            </w:tcBorders>
+            <w:vAlign w:val="center"/>
+          </w:tcPr>
+          <w:p>
+            <w:pPr>
+              <w:spacing w:after="0"/>
+              <w:jc w:val="center"/>
+            </w:pPr>
+            <w:r/>
+            <w:r>
+              <w:rPr>
+                <w:rFonts w:ascii="Aptos" w:hAnsi="Aptos"/>
+                <w:b/>
+                <w:color w:val="FFFFFF"/>
+                <w:sz w:val="16"/>
+              </w:rPr>
+              <w:t>Exit condition</w:t>
+            </w:r>
+          </w:p>
+        </w:tc>
+      </w:tr>
+      <w:tr>
+        <w:tc>
+          <w:tcPr>
+            <w:tcW w:type="dxa" w:w="1656"/>
+            <w:shd w:fill="FFFFFF"/>
+            <w:tcBorders>
+              <w:top w:val="single" w:sz="6" w:color="D9D9D9"/>
+              <w:left w:val="single" w:sz="6" w:color="D9D9D9"/>
+              <w:bottom w:val="single" w:sz="6" w:color="D9D9D9"/>
+              <w:right w:val="single" w:sz="6" w:color="D9D9D9"/>
+            </w:tcBorders>
+            <w:vAlign w:val="center"/>
+          </w:tcPr>
+          <w:p>
+            <w:pPr>
+              <w:spacing w:after="0"/>
+              <w:jc w:val="left"/>
+            </w:pPr>
+            <w:r/>
+            <w:r>
+              <w:rPr>
+                <w:rFonts w:ascii="Aptos" w:hAnsi="Aptos"/>
+                <w:b w:val="0"/>
+                <w:color w:val="000000"/>
+                <w:sz w:val="16"/>
+              </w:rPr>
+              <w:t>1. Stabilize evidence</w:t>
+            </w:r>
+          </w:p>
+        </w:tc>
+        <w:tc>
+          <w:tcPr>
+            <w:tcW w:type="dxa" w:w="1224"/>
+            <w:shd w:fill="FFFFFF"/>
+            <w:tcBorders>
+              <w:top w:val="single" w:sz="6" w:color="D9D9D9"/>
+              <w:left w:val="single" w:sz="6" w:color="D9D9D9"/>
+              <w:bottom w:val="single" w:sz="6" w:color="D9D9D9"/>
+              <w:right w:val="single" w:sz="6" w:color="D9D9D9"/>
+            </w:tcBorders>
+            <w:vAlign w:val="center"/>
+          </w:tcPr>
+          <w:p>
+            <w:pPr>
+              <w:spacing w:after="0"/>
+              <w:jc w:val="left"/>
+            </w:pPr>
+            <w:r/>
+            <w:r>
+              <w:rPr>
+                <w:rFonts w:ascii="Aptos" w:hAnsi="Aptos"/>
+                <w:b w:val="0"/>
+                <w:color w:val="000000"/>
+                <w:sz w:val="16"/>
+              </w:rPr>
+              <w:t>Weeks 1–2</w:t>
+            </w:r>
+          </w:p>
+        </w:tc>
+        <w:tc>
+          <w:tcPr>
+            <w:tcW w:type="dxa" w:w="4032"/>
+            <w:shd w:fill="FFFFFF"/>
+            <w:tcBorders>
+              <w:top w:val="single" w:sz="6" w:color="D9D9D9"/>
+              <w:left w:val="single" w:sz="6" w:color="D9D9D9"/>
+              <w:bottom w:val="single" w:sz="6" w:color="D9D9D9"/>
+              <w:right w:val="single" w:sz="6" w:color="D9D9D9"/>
+            </w:tcBorders>
+            <w:vAlign w:val="center"/>
+          </w:tcPr>
+          <w:p>
+            <w:pPr>
+              <w:spacing w:after="0"/>
+              <w:jc w:val="left"/>
+            </w:pPr>
+            <w:r/>
+            <w:r>
+              <w:rPr>
+                <w:rFonts w:ascii="Aptos" w:hAnsi="Aptos"/>
+                <w:b w:val="0"/>
+                <w:color w:val="000000"/>
+                <w:sz w:val="16"/>
+              </w:rPr>
+              <w:t>Restore database connection; run all feeds; verify source counts and canonical links.</w:t>
+            </w:r>
+          </w:p>
+        </w:tc>
+        <w:tc>
+          <w:tcPr>
+            <w:tcW w:type="dxa" w:w="2448"/>
+            <w:shd w:fill="FFFFFF"/>
+            <w:tcBorders>
+              <w:top w:val="single" w:sz="6" w:color="D9D9D9"/>
+              <w:left w:val="single" w:sz="6" w:color="D9D9D9"/>
+              <w:bottom w:val="single" w:sz="6" w:color="D9D9D9"/>
+              <w:right w:val="single" w:sz="6" w:color="D9D9D9"/>
+            </w:tcBorders>
+            <w:vAlign w:val="center"/>
+          </w:tcPr>
+          <w:p>
+            <w:pPr>
+              <w:spacing w:after="0"/>
+              <w:jc w:val="left"/>
+            </w:pPr>
+            <w:r/>
+            <w:r>
+              <w:rPr>
+                <w:rFonts w:ascii="Aptos" w:hAnsi="Aptos"/>
+                <w:b w:val="0"/>
+                <w:color w:val="000000"/>
+                <w:sz w:val="16"/>
+              </w:rPr>
+              <w:t>Repeatable import with recorded successes and failures.</w:t>
+            </w:r>
+          </w:p>
+        </w:tc>
+      </w:tr>
+      <w:tr>
+        <w:tc>
+          <w:tcPr>
+            <w:tcW w:type="dxa" w:w="1656"/>
+            <w:shd w:fill="F4F7FA"/>
+            <w:tcBorders>
+              <w:top w:val="single" w:sz="6" w:color="D9D9D9"/>
+              <w:left w:val="single" w:sz="6" w:color="D9D9D9"/>
+              <w:bottom w:val="single" w:sz="6" w:color="D9D9D9"/>
+              <w:right w:val="single" w:sz="6" w:color="D9D9D9"/>
+            </w:tcBorders>
+            <w:vAlign w:val="center"/>
+          </w:tcPr>
+          <w:p>
+            <w:pPr>
+              <w:spacing w:after="0"/>
+              <w:jc w:val="left"/>
+            </w:pPr>
+            <w:r/>
+            <w:r>
+              <w:rPr>
+                <w:rFonts w:ascii="Aptos" w:hAnsi="Aptos"/>
+                <w:b w:val="0"/>
+                <w:color w:val="000000"/>
+                <w:sz w:val="16"/>
+              </w:rPr>
+              <w:t>2. Validate taxonomy</w:t>
+            </w:r>
+          </w:p>
+        </w:tc>
+        <w:tc>
+          <w:tcPr>
+            <w:tcW w:type="dxa" w:w="1224"/>
+            <w:shd w:fill="F4F7FA"/>
+            <w:tcBorders>
+              <w:top w:val="single" w:sz="6" w:color="D9D9D9"/>
+              <w:left w:val="single" w:sz="6" w:color="D9D9D9"/>
+              <w:bottom w:val="single" w:sz="6" w:color="D9D9D9"/>
+              <w:right w:val="single" w:sz="6" w:color="D9D9D9"/>
+            </w:tcBorders>
+            <w:vAlign w:val="center"/>
+          </w:tcPr>
+          <w:p>
+            <w:pPr>
+              <w:spacing w:after="0"/>
+              <w:jc w:val="left"/>
+            </w:pPr>
+            <w:r/>
+            <w:r>
+              <w:rPr>
+                <w:rFonts w:ascii="Aptos" w:hAnsi="Aptos"/>
+                <w:b w:val="0"/>
+                <w:color w:val="000000"/>
+                <w:sz w:val="16"/>
+              </w:rPr>
+              <w:t>Weeks 2–4</w:t>
+            </w:r>
+          </w:p>
+        </w:tc>
+        <w:tc>
+          <w:tcPr>
+            <w:tcW w:type="dxa" w:w="4032"/>
+            <w:shd w:fill="F4F7FA"/>
+            <w:tcBorders>
+              <w:top w:val="single" w:sz="6" w:color="D9D9D9"/>
+              <w:left w:val="single" w:sz="6" w:color="D9D9D9"/>
+              <w:bottom w:val="single" w:sz="6" w:color="D9D9D9"/>
+              <w:right w:val="single" w:sz="6" w:color="D9D9D9"/>
+            </w:tcBorders>
+            <w:vAlign w:val="center"/>
+          </w:tcPr>
+          <w:p>
+            <w:pPr>
+              <w:spacing w:after="0"/>
+              <w:jc w:val="left"/>
+            </w:pPr>
+            <w:r/>
+            <w:r>
+              <w:rPr>
+                <w:rFonts w:ascii="Aptos" w:hAnsi="Aptos"/>
+                <w:b w:val="0"/>
+                <w:color w:val="000000"/>
+                <w:sz w:val="16"/>
+              </w:rPr>
+              <w:t>Faculty and career-services review of degree roles, title phrases, and skill synonyms.</w:t>
+            </w:r>
+          </w:p>
+        </w:tc>
+        <w:tc>
+          <w:tcPr>
+            <w:tcW w:type="dxa" w:w="2448"/>
+            <w:shd w:fill="F4F7FA"/>
+            <w:tcBorders>
+              <w:top w:val="single" w:sz="6" w:color="D9D9D9"/>
+              <w:left w:val="single" w:sz="6" w:color="D9D9D9"/>
+              <w:bottom w:val="single" w:sz="6" w:color="D9D9D9"/>
+              <w:right w:val="single" w:sz="6" w:color="D9D9D9"/>
+            </w:tcBorders>
+            <w:vAlign w:val="center"/>
+          </w:tcPr>
+          <w:p>
+            <w:pPr>
+              <w:spacing w:after="0"/>
+              <w:jc w:val="left"/>
+            </w:pPr>
+            <w:r/>
+            <w:r>
+              <w:rPr>
+                <w:rFonts w:ascii="Aptos" w:hAnsi="Aptos"/>
+                <w:b w:val="0"/>
+                <w:color w:val="000000"/>
+                <w:sz w:val="16"/>
+              </w:rPr>
+              <w:t>Approved mapping with false-positive and false-negative samples.</w:t>
+            </w:r>
+          </w:p>
+        </w:tc>
+      </w:tr>
+      <w:tr>
+        <w:tc>
+          <w:tcPr>
+            <w:tcW w:type="dxa" w:w="1656"/>
+            <w:shd w:fill="FFFFFF"/>
+            <w:tcBorders>
+              <w:top w:val="single" w:sz="6" w:color="D9D9D9"/>
+              <w:left w:val="single" w:sz="6" w:color="D9D9D9"/>
+              <w:bottom w:val="single" w:sz="6" w:color="D9D9D9"/>
+              <w:right w:val="single" w:sz="6" w:color="D9D9D9"/>
+            </w:tcBorders>
+            <w:vAlign w:val="center"/>
+          </w:tcPr>
+          <w:p>
+            <w:pPr>
+              <w:spacing w:after="0"/>
+              <w:jc w:val="left"/>
+            </w:pPr>
+            <w:r/>
+            <w:r>
+              <w:rPr>
+                <w:rFonts w:ascii="Aptos" w:hAnsi="Aptos"/>
+                <w:b w:val="0"/>
+                <w:color w:val="000000"/>
+                <w:sz w:val="16"/>
+              </w:rPr>
+              <w:t>3. Load curriculum</w:t>
+            </w:r>
+          </w:p>
+        </w:tc>
+        <w:tc>
+          <w:tcPr>
+            <w:tcW w:type="dxa" w:w="1224"/>
+            <w:shd w:fill="FFFFFF"/>
+            <w:tcBorders>
+              <w:top w:val="single" w:sz="6" w:color="D9D9D9"/>
+              <w:left w:val="single" w:sz="6" w:color="D9D9D9"/>
+              <w:bottom w:val="single" w:sz="6" w:color="D9D9D9"/>
+              <w:right w:val="single" w:sz="6" w:color="D9D9D9"/>
+            </w:tcBorders>
+            <w:vAlign w:val="center"/>
+          </w:tcPr>
+          <w:p>
+            <w:pPr>
+              <w:spacing w:after="0"/>
+              <w:jc w:val="left"/>
+            </w:pPr>
+            <w:r/>
+            <w:r>
+              <w:rPr>
+                <w:rFonts w:ascii="Aptos" w:hAnsi="Aptos"/>
+                <w:b w:val="0"/>
+                <w:color w:val="000000"/>
+                <w:sz w:val="16"/>
+              </w:rPr>
+              <w:t>Weeks 3–6</w:t>
+            </w:r>
+          </w:p>
+        </w:tc>
+        <w:tc>
+          <w:tcPr>
+            <w:tcW w:type="dxa" w:w="4032"/>
+            <w:shd w:fill="FFFFFF"/>
+            <w:tcBorders>
+              <w:top w:val="single" w:sz="6" w:color="D9D9D9"/>
+              <w:left w:val="single" w:sz="6" w:color="D9D9D9"/>
+              <w:bottom w:val="single" w:sz="6" w:color="D9D9D9"/>
+              <w:right w:val="single" w:sz="6" w:color="D9D9D9"/>
+            </w:tcBorders>
+            <w:vAlign w:val="center"/>
+          </w:tcPr>
+          <w:p>
+            <w:pPr>
+              <w:spacing w:after="0"/>
+              <w:jc w:val="left"/>
+            </w:pPr>
+            <w:r/>
+            <w:r>
+              <w:rPr>
+                <w:rFonts w:ascii="Aptos" w:hAnsi="Aptos"/>
+                <w:b w:val="0"/>
+                <w:color w:val="000000"/>
+                <w:sz w:val="16"/>
+              </w:rPr>
+              <w:t>Current syllabi, program mappings, course outcomes, topics, tools, and assessments.</w:t>
+            </w:r>
+          </w:p>
+        </w:tc>
+        <w:tc>
+          <w:tcPr>
+            <w:tcW w:type="dxa" w:w="2448"/>
+            <w:shd w:fill="FFFFFF"/>
+            <w:tcBorders>
+              <w:top w:val="single" w:sz="6" w:color="D9D9D9"/>
+              <w:left w:val="single" w:sz="6" w:color="D9D9D9"/>
+              <w:bottom w:val="single" w:sz="6" w:color="D9D9D9"/>
+              <w:right w:val="single" w:sz="6" w:color="D9D9D9"/>
+            </w:tcBorders>
+            <w:vAlign w:val="center"/>
+          </w:tcPr>
+          <w:p>
+            <w:pPr>
+              <w:spacing w:after="0"/>
+              <w:jc w:val="left"/>
+            </w:pPr>
+            <w:r/>
+            <w:r>
+              <w:rPr>
+                <w:rFonts w:ascii="Aptos" w:hAnsi="Aptos"/>
+                <w:b w:val="0"/>
+                <w:color w:val="000000"/>
+                <w:sz w:val="16"/>
+              </w:rPr>
+              <w:t>Every included course has an owner and review status.</w:t>
+            </w:r>
+          </w:p>
+        </w:tc>
+      </w:tr>
+      <w:tr>
+        <w:tc>
+          <w:tcPr>
+            <w:tcW w:type="dxa" w:w="1656"/>
+            <w:shd w:fill="F4F7FA"/>
+            <w:tcBorders>
+              <w:top w:val="single" w:sz="6" w:color="D9D9D9"/>
+              <w:left w:val="single" w:sz="6" w:color="D9D9D9"/>
+              <w:bottom w:val="single" w:sz="6" w:color="D9D9D9"/>
+              <w:right w:val="single" w:sz="6" w:color="D9D9D9"/>
+            </w:tcBorders>
+            <w:vAlign w:val="center"/>
+          </w:tcPr>
+          <w:p>
+            <w:pPr>
+              <w:spacing w:after="0"/>
+              <w:jc w:val="left"/>
+            </w:pPr>
+            <w:r/>
+            <w:r>
+              <w:rPr>
+                <w:rFonts w:ascii="Aptos" w:hAnsi="Aptos"/>
+                <w:b w:val="0"/>
+                <w:color w:val="000000"/>
+                <w:sz w:val="16"/>
+              </w:rPr>
+              <w:t>4. Score alignment</w:t>
+            </w:r>
+          </w:p>
+        </w:tc>
+        <w:tc>
+          <w:tcPr>
+            <w:tcW w:type="dxa" w:w="1224"/>
+            <w:shd w:fill="F4F7FA"/>
+            <w:tcBorders>
+              <w:top w:val="single" w:sz="6" w:color="D9D9D9"/>
+              <w:left w:val="single" w:sz="6" w:color="D9D9D9"/>
+              <w:bottom w:val="single" w:sz="6" w:color="D9D9D9"/>
+              <w:right w:val="single" w:sz="6" w:color="D9D9D9"/>
+            </w:tcBorders>
+            <w:vAlign w:val="center"/>
+          </w:tcPr>
+          <w:p>
+            <w:pPr>
+              <w:spacing w:after="0"/>
+              <w:jc w:val="left"/>
+            </w:pPr>
+            <w:r/>
+            <w:r>
+              <w:rPr>
+                <w:rFonts w:ascii="Aptos" w:hAnsi="Aptos"/>
+                <w:b w:val="0"/>
+                <w:color w:val="000000"/>
+                <w:sz w:val="16"/>
+              </w:rPr>
+              <w:t>Weeks 5–8</w:t>
+            </w:r>
+          </w:p>
+        </w:tc>
+        <w:tc>
+          <w:tcPr>
+            <w:tcW w:type="dxa" w:w="4032"/>
+            <w:shd w:fill="F4F7FA"/>
+            <w:tcBorders>
+              <w:top w:val="single" w:sz="6" w:color="D9D9D9"/>
+              <w:left w:val="single" w:sz="6" w:color="D9D9D9"/>
+              <w:bottom w:val="single" w:sz="6" w:color="D9D9D9"/>
+              <w:right w:val="single" w:sz="6" w:color="D9D9D9"/>
+            </w:tcBorders>
+            <w:vAlign w:val="center"/>
+          </w:tcPr>
+          <w:p>
+            <w:pPr>
+              <w:spacing w:after="0"/>
+              <w:jc w:val="left"/>
+            </w:pPr>
+            <w:r/>
+            <w:r>
+              <w:rPr>
+                <w:rFonts w:ascii="Aptos" w:hAnsi="Aptos"/>
+                <w:b w:val="0"/>
+                <w:color w:val="000000"/>
+                <w:sz w:val="16"/>
+              </w:rPr>
+              <w:t>Coverage rows, weighted degree score, missing-skill priorities, and faculty review workflow.</w:t>
+            </w:r>
+          </w:p>
+        </w:tc>
+        <w:tc>
+          <w:tcPr>
+            <w:tcW w:type="dxa" w:w="2448"/>
+            <w:shd w:fill="F4F7FA"/>
+            <w:tcBorders>
+              <w:top w:val="single" w:sz="6" w:color="D9D9D9"/>
+              <w:left w:val="single" w:sz="6" w:color="D9D9D9"/>
+              <w:bottom w:val="single" w:sz="6" w:color="D9D9D9"/>
+              <w:right w:val="single" w:sz="6" w:color="D9D9D9"/>
+            </w:tcBorders>
+            <w:vAlign w:val="center"/>
+          </w:tcPr>
+          <w:p>
+            <w:pPr>
+              <w:spacing w:after="0"/>
+              <w:jc w:val="left"/>
+            </w:pPr>
+            <w:r/>
+            <w:r>
+              <w:rPr>
+                <w:rFonts w:ascii="Aptos" w:hAnsi="Aptos"/>
+                <w:b w:val="0"/>
+                <w:color w:val="000000"/>
+                <w:sz w:val="16"/>
+              </w:rPr>
+              <w:t>Scores are reproducible from stored evidence.</w:t>
+            </w:r>
+          </w:p>
+        </w:tc>
+      </w:tr>
+      <w:tr>
+        <w:tc>
+          <w:tcPr>
+            <w:tcW w:type="dxa" w:w="1656"/>
+            <w:shd w:fill="FFFFFF"/>
+            <w:tcBorders>
+              <w:top w:val="single" w:sz="6" w:color="D9D9D9"/>
+              <w:left w:val="single" w:sz="6" w:color="D9D9D9"/>
+              <w:bottom w:val="single" w:sz="6" w:color="D9D9D9"/>
+              <w:right w:val="single" w:sz="6" w:color="D9D9D9"/>
+            </w:tcBorders>
+            <w:vAlign w:val="center"/>
+          </w:tcPr>
+          <w:p>
+            <w:pPr>
+              <w:spacing w:after="0"/>
+              <w:jc w:val="left"/>
+            </w:pPr>
+            <w:r/>
+            <w:r>
+              <w:rPr>
+                <w:rFonts w:ascii="Aptos" w:hAnsi="Aptos"/>
+                <w:b w:val="0"/>
+                <w:color w:val="000000"/>
+                <w:sz w:val="16"/>
+              </w:rPr>
+              <w:t>5. Add student evidence</w:t>
+            </w:r>
+          </w:p>
+        </w:tc>
+        <w:tc>
+          <w:tcPr>
+            <w:tcW w:type="dxa" w:w="1224"/>
+            <w:shd w:fill="FFFFFF"/>
+            <w:tcBorders>
+              <w:top w:val="single" w:sz="6" w:color="D9D9D9"/>
+              <w:left w:val="single" w:sz="6" w:color="D9D9D9"/>
+              <w:bottom w:val="single" w:sz="6" w:color="D9D9D9"/>
+              <w:right w:val="single" w:sz="6" w:color="D9D9D9"/>
+            </w:tcBorders>
+            <w:vAlign w:val="center"/>
+          </w:tcPr>
+          <w:p>
+            <w:pPr>
+              <w:spacing w:after="0"/>
+              <w:jc w:val="left"/>
+            </w:pPr>
+            <w:r/>
+            <w:r>
+              <w:rPr>
+                <w:rFonts w:ascii="Aptos" w:hAnsi="Aptos"/>
+                <w:b w:val="0"/>
+                <w:color w:val="000000"/>
+                <w:sz w:val="16"/>
+              </w:rPr>
+              <w:t>Weeks 7–10</w:t>
+            </w:r>
+          </w:p>
+        </w:tc>
+        <w:tc>
+          <w:tcPr>
+            <w:tcW w:type="dxa" w:w="4032"/>
+            <w:shd w:fill="FFFFFF"/>
+            <w:tcBorders>
+              <w:top w:val="single" w:sz="6" w:color="D9D9D9"/>
+              <w:left w:val="single" w:sz="6" w:color="D9D9D9"/>
+              <w:bottom w:val="single" w:sz="6" w:color="D9D9D9"/>
+              <w:right w:val="single" w:sz="6" w:color="D9D9D9"/>
+            </w:tcBorders>
+            <w:vAlign w:val="center"/>
+          </w:tcPr>
+          <w:p>
+            <w:pPr>
+              <w:spacing w:after="0"/>
+              <w:jc w:val="left"/>
+            </w:pPr>
+            <w:r/>
+            <w:r>
+              <w:rPr>
+                <w:rFonts w:ascii="Aptos" w:hAnsi="Aptos"/>
+                <w:b w:val="0"/>
+                <w:color w:val="000000"/>
+                <w:sz w:val="16"/>
+              </w:rPr>
+              <w:t>Private resume, project, course-completion, preference, and authorization records.</w:t>
+            </w:r>
+          </w:p>
+        </w:tc>
+        <w:tc>
+          <w:tcPr>
+            <w:tcW w:type="dxa" w:w="2448"/>
+            <w:shd w:fill="FFFFFF"/>
+            <w:tcBorders>
+              <w:top w:val="single" w:sz="6" w:color="D9D9D9"/>
+              <w:left w:val="single" w:sz="6" w:color="D9D9D9"/>
+              <w:bottom w:val="single" w:sz="6" w:color="D9D9D9"/>
+              <w:right w:val="single" w:sz="6" w:color="D9D9D9"/>
+            </w:tcBorders>
+            <w:vAlign w:val="center"/>
+          </w:tcPr>
+          <w:p>
+            <w:pPr>
+              <w:spacing w:after="0"/>
+              <w:jc w:val="left"/>
+            </w:pPr>
+            <w:r/>
+            <w:r>
+              <w:rPr>
+                <w:rFonts w:ascii="Aptos" w:hAnsi="Aptos"/>
+                <w:b w:val="0"/>
+                <w:color w:val="000000"/>
+                <w:sz w:val="16"/>
+              </w:rPr>
+              <w:t>Row-level access tests pass for each user role.</w:t>
+            </w:r>
+          </w:p>
+        </w:tc>
+      </w:tr>
+      <w:tr>
+        <w:tc>
+          <w:tcPr>
+            <w:tcW w:type="dxa" w:w="1656"/>
+            <w:shd w:fill="F4F7FA"/>
+            <w:tcBorders>
+              <w:top w:val="single" w:sz="6" w:color="D9D9D9"/>
+              <w:left w:val="single" w:sz="6" w:color="D9D9D9"/>
+              <w:bottom w:val="single" w:sz="6" w:color="D9D9D9"/>
+              <w:right w:val="single" w:sz="6" w:color="D9D9D9"/>
+            </w:tcBorders>
+            <w:vAlign w:val="center"/>
+          </w:tcPr>
+          <w:p>
+            <w:pPr>
+              <w:spacing w:after="0"/>
+              <w:jc w:val="left"/>
+            </w:pPr>
+            <w:r/>
+            <w:r>
+              <w:rPr>
+                <w:rFonts w:ascii="Aptos" w:hAnsi="Aptos"/>
+                <w:b w:val="0"/>
+                <w:color w:val="000000"/>
+                <w:sz w:val="16"/>
+              </w:rPr>
+              <w:t>6. Pilot advising</w:t>
+            </w:r>
+          </w:p>
+        </w:tc>
+        <w:tc>
+          <w:tcPr>
+            <w:tcW w:type="dxa" w:w="1224"/>
+            <w:shd w:fill="F4F7FA"/>
+            <w:tcBorders>
+              <w:top w:val="single" w:sz="6" w:color="D9D9D9"/>
+              <w:left w:val="single" w:sz="6" w:color="D9D9D9"/>
+              <w:bottom w:val="single" w:sz="6" w:color="D9D9D9"/>
+              <w:right w:val="single" w:sz="6" w:color="D9D9D9"/>
+            </w:tcBorders>
+            <w:vAlign w:val="center"/>
+          </w:tcPr>
+          <w:p>
+            <w:pPr>
+              <w:spacing w:after="0"/>
+              <w:jc w:val="left"/>
+            </w:pPr>
+            <w:r/>
+            <w:r>
+              <w:rPr>
+                <w:rFonts w:ascii="Aptos" w:hAnsi="Aptos"/>
+                <w:b w:val="0"/>
+                <w:color w:val="000000"/>
+                <w:sz w:val="16"/>
+              </w:rPr>
+              <w:t>Weeks 10–12</w:t>
+            </w:r>
+          </w:p>
+        </w:tc>
+        <w:tc>
+          <w:tcPr>
+            <w:tcW w:type="dxa" w:w="4032"/>
+            <w:shd w:fill="F4F7FA"/>
+            <w:tcBorders>
+              <w:top w:val="single" w:sz="6" w:color="D9D9D9"/>
+              <w:left w:val="single" w:sz="6" w:color="D9D9D9"/>
+              <w:bottom w:val="single" w:sz="6" w:color="D9D9D9"/>
+              <w:right w:val="single" w:sz="6" w:color="D9D9D9"/>
+            </w:tcBorders>
+            <w:vAlign w:val="center"/>
+          </w:tcPr>
+          <w:p>
+            <w:pPr>
+              <w:spacing w:after="0"/>
+              <w:jc w:val="left"/>
+            </w:pPr>
+            <w:r/>
+            <w:r>
+              <w:rPr>
+                <w:rFonts w:ascii="Aptos" w:hAnsi="Aptos"/>
+                <w:b w:val="0"/>
+                <w:color w:val="000000"/>
+                <w:sz w:val="16"/>
+              </w:rPr>
+              <w:t>Advisor dashboard, student readiness view, role matches, and feedback collection.</w:t>
+            </w:r>
+          </w:p>
+        </w:tc>
+        <w:tc>
+          <w:tcPr>
+            <w:tcW w:type="dxa" w:w="2448"/>
+            <w:shd w:fill="F4F7FA"/>
+            <w:tcBorders>
+              <w:top w:val="single" w:sz="6" w:color="D9D9D9"/>
+              <w:left w:val="single" w:sz="6" w:color="D9D9D9"/>
+              <w:bottom w:val="single" w:sz="6" w:color="D9D9D9"/>
+              <w:right w:val="single" w:sz="6" w:color="D9D9D9"/>
+            </w:tcBorders>
+            <w:vAlign w:val="center"/>
+          </w:tcPr>
+          <w:p>
+            <w:pPr>
+              <w:spacing w:after="0"/>
+              <w:jc w:val="left"/>
+            </w:pPr>
+            <w:r/>
+            <w:r>
+              <w:rPr>
+                <w:rFonts w:ascii="Aptos" w:hAnsi="Aptos"/>
+                <w:b w:val="0"/>
+                <w:color w:val="000000"/>
+                <w:sz w:val="16"/>
+              </w:rPr>
+              <w:t>Pilot users can explain every recommendation and its evidence.</w:t>
+            </w:r>
+          </w:p>
+        </w:tc>
+      </w:tr>
+    </w:tbl>
+    <w:p>
+      <w:pPr>
+        <w:spacing w:after="0"/>
+      </w:pPr>
+    </w:p>
+    <w:p>
+      <w:pPr>
+        <w:pStyle w:val="Heading2"/>
+      </w:pPr>
+      <w:r>
+        <w:t>Operating Metrics</w:t>
+      </w:r>
+    </w:p>
+    <w:p>
+      <w:pPr>
+        <w:pStyle w:val="ListBullet"/>
+      </w:pPr>
+      <w:r>
+        <w:t>Evidence volume: qualified jobs, active sources, distinct titles, and descriptions retained by degree and collection date.</w:t>
+      </w:r>
+    </w:p>
+    <w:p>
+      <w:pPr>
+        <w:pStyle w:val="ListBullet"/>
+      </w:pPr>
+      <w:r>
+        <w:t>Quality: manually reviewed precision for role classification and explicit skill extraction.</w:t>
+      </w:r>
+    </w:p>
+    <w:p>
+      <w:pPr>
+        <w:pStyle w:val="ListBullet"/>
+      </w:pPr>
+      <w:r>
+        <w:t>Coverage: percentage of priority skills with verified course evidence and assessed student work.</w:t>
+      </w:r>
+    </w:p>
+    <w:p>
+      <w:pPr>
+        <w:pStyle w:val="ListBullet"/>
+      </w:pPr>
+      <w:r>
+        <w:t>Freshness: age of the newest and oldest active listing, plus source-specific collection failures.</w:t>
+      </w:r>
+    </w:p>
+    <w:p>
+      <w:pPr>
+        <w:pStyle w:val="ListBullet"/>
+      </w:pPr>
+      <w:r>
+        <w:t>Student action: portfolio evidence completed, resume gaps resolved, suitable roles saved, and applications prepared.</w:t>
+      </w:r>
+    </w:p>
+    <w:p>
+      <w:r>
+        <w:br w:type="page"/>
       </w:r>
     </w:p>
     <w:p>
@@ -5086,6 +7606,464 @@
         <w:spacing w:after="0"/>
       </w:pPr>
     </w:p>
+    <w:p>
+      <w:pPr>
+        <w:pStyle w:val="Heading1"/>
+      </w:pPr>
+      <w:r>
+        <w:t>Data Governance and Security</w:t>
+      </w:r>
+    </w:p>
+    <w:tbl>
+      <w:tblPr>
+        <w:tblW w:type="auto" w:w="0"/>
+        <w:jc w:val="center"/>
+        <w:tblLayout w:type="fixed"/>
+        <w:tblLook w:firstColumn="1" w:firstRow="1" w:lastColumn="0" w:lastRow="0" w:noHBand="0" w:noVBand="1" w:val="04A0"/>
+      </w:tblPr>
+      <w:tblGrid>
+        <w:gridCol w:w="4997"/>
+        <w:gridCol w:w="4997"/>
+      </w:tblGrid>
+      <w:tr>
+        <w:tc>
+          <w:tcPr>
+            <w:tcW w:type="dxa" w:w="2160"/>
+            <w:shd w:fill="17365D"/>
+            <w:tcBorders>
+              <w:top w:val="single" w:sz="6" w:color="D9D9D9"/>
+              <w:left w:val="single" w:sz="6" w:color="D9D9D9"/>
+              <w:bottom w:val="single" w:sz="6" w:color="D9D9D9"/>
+              <w:right w:val="single" w:sz="6" w:color="D9D9D9"/>
+            </w:tcBorders>
+            <w:vAlign w:val="center"/>
+          </w:tcPr>
+          <w:p>
+            <w:pPr>
+              <w:spacing w:after="0"/>
+              <w:jc w:val="center"/>
+            </w:pPr>
+            <w:r/>
+            <w:r>
+              <w:rPr>
+                <w:rFonts w:ascii="Aptos" w:hAnsi="Aptos"/>
+                <w:b/>
+                <w:color w:val="FFFFFF"/>
+                <w:sz w:val="16"/>
+              </w:rPr>
+              <w:t>Control</w:t>
+            </w:r>
+          </w:p>
+        </w:tc>
+        <w:tc>
+          <w:tcPr>
+            <w:tcW w:type="dxa" w:w="7200"/>
+            <w:shd w:fill="17365D"/>
+            <w:tcBorders>
+              <w:top w:val="single" w:sz="6" w:color="D9D9D9"/>
+              <w:left w:val="single" w:sz="6" w:color="D9D9D9"/>
+              <w:bottom w:val="single" w:sz="6" w:color="D9D9D9"/>
+              <w:right w:val="single" w:sz="6" w:color="D9D9D9"/>
+            </w:tcBorders>
+            <w:vAlign w:val="center"/>
+          </w:tcPr>
+          <w:p>
+            <w:pPr>
+              <w:spacing w:after="0"/>
+              <w:jc w:val="center"/>
+            </w:pPr>
+            <w:r/>
+            <w:r>
+              <w:rPr>
+                <w:rFonts w:ascii="Aptos" w:hAnsi="Aptos"/>
+                <w:b/>
+                <w:color w:val="FFFFFF"/>
+                <w:sz w:val="16"/>
+              </w:rPr>
+              <w:t>Implementation expectation</w:t>
+            </w:r>
+          </w:p>
+        </w:tc>
+      </w:tr>
+      <w:tr>
+        <w:tc>
+          <w:tcPr>
+            <w:tcW w:type="dxa" w:w="2160"/>
+            <w:shd w:fill="FFFFFF"/>
+            <w:tcBorders>
+              <w:top w:val="single" w:sz="6" w:color="D9D9D9"/>
+              <w:left w:val="single" w:sz="6" w:color="D9D9D9"/>
+              <w:bottom w:val="single" w:sz="6" w:color="D9D9D9"/>
+              <w:right w:val="single" w:sz="6" w:color="D9D9D9"/>
+            </w:tcBorders>
+            <w:vAlign w:val="center"/>
+          </w:tcPr>
+          <w:p>
+            <w:pPr>
+              <w:spacing w:after="0"/>
+              <w:jc w:val="left"/>
+            </w:pPr>
+            <w:r/>
+            <w:r>
+              <w:rPr>
+                <w:rFonts w:ascii="Aptos" w:hAnsi="Aptos"/>
+                <w:b w:val="0"/>
+                <w:color w:val="000000"/>
+                <w:sz w:val="16"/>
+              </w:rPr>
+              <w:t>Data minimization</w:t>
+            </w:r>
+          </w:p>
+        </w:tc>
+        <w:tc>
+          <w:tcPr>
+            <w:tcW w:type="dxa" w:w="7200"/>
+            <w:shd w:fill="FFFFFF"/>
+            <w:tcBorders>
+              <w:top w:val="single" w:sz="6" w:color="D9D9D9"/>
+              <w:left w:val="single" w:sz="6" w:color="D9D9D9"/>
+              <w:bottom w:val="single" w:sz="6" w:color="D9D9D9"/>
+              <w:right w:val="single" w:sz="6" w:color="D9D9D9"/>
+            </w:tcBorders>
+            <w:vAlign w:val="center"/>
+          </w:tcPr>
+          <w:p>
+            <w:pPr>
+              <w:spacing w:after="0"/>
+              <w:jc w:val="left"/>
+            </w:pPr>
+            <w:r/>
+            <w:r>
+              <w:rPr>
+                <w:rFonts w:ascii="Aptos" w:hAnsi="Aptos"/>
+                <w:b w:val="0"/>
+                <w:color w:val="000000"/>
+                <w:sz w:val="16"/>
+              </w:rPr>
+              <w:t>Store only the profile, academic, resume, and preference fields needed for matching and advising.</w:t>
+            </w:r>
+          </w:p>
+        </w:tc>
+      </w:tr>
+      <w:tr>
+        <w:tc>
+          <w:tcPr>
+            <w:tcW w:type="dxa" w:w="2160"/>
+            <w:shd w:fill="F4F7FA"/>
+            <w:tcBorders>
+              <w:top w:val="single" w:sz="6" w:color="D9D9D9"/>
+              <w:left w:val="single" w:sz="6" w:color="D9D9D9"/>
+              <w:bottom w:val="single" w:sz="6" w:color="D9D9D9"/>
+              <w:right w:val="single" w:sz="6" w:color="D9D9D9"/>
+            </w:tcBorders>
+            <w:vAlign w:val="center"/>
+          </w:tcPr>
+          <w:p>
+            <w:pPr>
+              <w:spacing w:after="0"/>
+              <w:jc w:val="left"/>
+            </w:pPr>
+            <w:r/>
+            <w:r>
+              <w:rPr>
+                <w:rFonts w:ascii="Aptos" w:hAnsi="Aptos"/>
+                <w:b w:val="0"/>
+                <w:color w:val="000000"/>
+                <w:sz w:val="16"/>
+              </w:rPr>
+              <w:t>Private-by-default access</w:t>
+            </w:r>
+          </w:p>
+        </w:tc>
+        <w:tc>
+          <w:tcPr>
+            <w:tcW w:type="dxa" w:w="7200"/>
+            <w:shd w:fill="F4F7FA"/>
+            <w:tcBorders>
+              <w:top w:val="single" w:sz="6" w:color="D9D9D9"/>
+              <w:left w:val="single" w:sz="6" w:color="D9D9D9"/>
+              <w:bottom w:val="single" w:sz="6" w:color="D9D9D9"/>
+              <w:right w:val="single" w:sz="6" w:color="D9D9D9"/>
+            </w:tcBorders>
+            <w:vAlign w:val="center"/>
+          </w:tcPr>
+          <w:p>
+            <w:pPr>
+              <w:spacing w:after="0"/>
+              <w:jc w:val="left"/>
+            </w:pPr>
+            <w:r/>
+            <w:r>
+              <w:rPr>
+                <w:rFonts w:ascii="Aptos" w:hAnsi="Aptos"/>
+                <w:b w:val="0"/>
+                <w:color w:val="000000"/>
+                <w:sz w:val="16"/>
+              </w:rPr>
+              <w:t>Use Supabase authentication and row-level security so students see their own records and approved staff see only authorized scopes.</w:t>
+            </w:r>
+          </w:p>
+        </w:tc>
+      </w:tr>
+      <w:tr>
+        <w:tc>
+          <w:tcPr>
+            <w:tcW w:type="dxa" w:w="2160"/>
+            <w:shd w:fill="FFFFFF"/>
+            <w:tcBorders>
+              <w:top w:val="single" w:sz="6" w:color="D9D9D9"/>
+              <w:left w:val="single" w:sz="6" w:color="D9D9D9"/>
+              <w:bottom w:val="single" w:sz="6" w:color="D9D9D9"/>
+              <w:right w:val="single" w:sz="6" w:color="D9D9D9"/>
+            </w:tcBorders>
+            <w:vAlign w:val="center"/>
+          </w:tcPr>
+          <w:p>
+            <w:pPr>
+              <w:spacing w:after="0"/>
+              <w:jc w:val="left"/>
+            </w:pPr>
+            <w:r/>
+            <w:r>
+              <w:rPr>
+                <w:rFonts w:ascii="Aptos" w:hAnsi="Aptos"/>
+                <w:b w:val="0"/>
+                <w:color w:val="000000"/>
+                <w:sz w:val="16"/>
+              </w:rPr>
+              <w:t>Service credentials</w:t>
+            </w:r>
+          </w:p>
+        </w:tc>
+        <w:tc>
+          <w:tcPr>
+            <w:tcW w:type="dxa" w:w="7200"/>
+            <w:shd w:fill="FFFFFF"/>
+            <w:tcBorders>
+              <w:top w:val="single" w:sz="6" w:color="D9D9D9"/>
+              <w:left w:val="single" w:sz="6" w:color="D9D9D9"/>
+              <w:bottom w:val="single" w:sz="6" w:color="D9D9D9"/>
+              <w:right w:val="single" w:sz="6" w:color="D9D9D9"/>
+            </w:tcBorders>
+            <w:vAlign w:val="center"/>
+          </w:tcPr>
+          <w:p>
+            <w:pPr>
+              <w:spacing w:after="0"/>
+              <w:jc w:val="left"/>
+            </w:pPr>
+            <w:r/>
+            <w:r>
+              <w:rPr>
+                <w:rFonts w:ascii="Aptos" w:hAnsi="Aptos"/>
+                <w:b w:val="0"/>
+                <w:color w:val="000000"/>
+                <w:sz w:val="16"/>
+              </w:rPr>
+              <w:t>Keep service-role keys on trusted servers; never expose them in the browser, reports, logs, or source control.</w:t>
+            </w:r>
+          </w:p>
+        </w:tc>
+      </w:tr>
+      <w:tr>
+        <w:tc>
+          <w:tcPr>
+            <w:tcW w:type="dxa" w:w="2160"/>
+            <w:shd w:fill="F4F7FA"/>
+            <w:tcBorders>
+              <w:top w:val="single" w:sz="6" w:color="D9D9D9"/>
+              <w:left w:val="single" w:sz="6" w:color="D9D9D9"/>
+              <w:bottom w:val="single" w:sz="6" w:color="D9D9D9"/>
+              <w:right w:val="single" w:sz="6" w:color="D9D9D9"/>
+            </w:tcBorders>
+            <w:vAlign w:val="center"/>
+          </w:tcPr>
+          <w:p>
+            <w:pPr>
+              <w:spacing w:after="0"/>
+              <w:jc w:val="left"/>
+            </w:pPr>
+            <w:r/>
+            <w:r>
+              <w:rPr>
+                <w:rFonts w:ascii="Aptos" w:hAnsi="Aptos"/>
+                <w:b w:val="0"/>
+                <w:color w:val="000000"/>
+                <w:sz w:val="16"/>
+              </w:rPr>
+              <w:t>Auditability</w:t>
+            </w:r>
+          </w:p>
+        </w:tc>
+        <w:tc>
+          <w:tcPr>
+            <w:tcW w:type="dxa" w:w="7200"/>
+            <w:shd w:fill="F4F7FA"/>
+            <w:tcBorders>
+              <w:top w:val="single" w:sz="6" w:color="D9D9D9"/>
+              <w:left w:val="single" w:sz="6" w:color="D9D9D9"/>
+              <w:bottom w:val="single" w:sz="6" w:color="D9D9D9"/>
+              <w:right w:val="single" w:sz="6" w:color="D9D9D9"/>
+            </w:tcBorders>
+            <w:vAlign w:val="center"/>
+          </w:tcPr>
+          <w:p>
+            <w:pPr>
+              <w:spacing w:after="0"/>
+              <w:jc w:val="left"/>
+            </w:pPr>
+            <w:r/>
+            <w:r>
+              <w:rPr>
+                <w:rFonts w:ascii="Aptos" w:hAnsi="Aptos"/>
+                <w:b w:val="0"/>
+                <w:color w:val="000000"/>
+                <w:sz w:val="16"/>
+              </w:rPr>
+              <w:t>Record privileged reads and writes, source imports, report generation, role changes, and administrative actions.</w:t>
+            </w:r>
+          </w:p>
+        </w:tc>
+      </w:tr>
+      <w:tr>
+        <w:tc>
+          <w:tcPr>
+            <w:tcW w:type="dxa" w:w="2160"/>
+            <w:shd w:fill="FFFFFF"/>
+            <w:tcBorders>
+              <w:top w:val="single" w:sz="6" w:color="D9D9D9"/>
+              <w:left w:val="single" w:sz="6" w:color="D9D9D9"/>
+              <w:bottom w:val="single" w:sz="6" w:color="D9D9D9"/>
+              <w:right w:val="single" w:sz="6" w:color="D9D9D9"/>
+            </w:tcBorders>
+            <w:vAlign w:val="center"/>
+          </w:tcPr>
+          <w:p>
+            <w:pPr>
+              <w:spacing w:after="0"/>
+              <w:jc w:val="left"/>
+            </w:pPr>
+            <w:r/>
+            <w:r>
+              <w:rPr>
+                <w:rFonts w:ascii="Aptos" w:hAnsi="Aptos"/>
+                <w:b w:val="0"/>
+                <w:color w:val="000000"/>
+                <w:sz w:val="16"/>
+              </w:rPr>
+              <w:t>Retention</w:t>
+            </w:r>
+          </w:p>
+        </w:tc>
+        <w:tc>
+          <w:tcPr>
+            <w:tcW w:type="dxa" w:w="7200"/>
+            <w:shd w:fill="FFFFFF"/>
+            <w:tcBorders>
+              <w:top w:val="single" w:sz="6" w:color="D9D9D9"/>
+              <w:left w:val="single" w:sz="6" w:color="D9D9D9"/>
+              <w:bottom w:val="single" w:sz="6" w:color="D9D9D9"/>
+              <w:right w:val="single" w:sz="6" w:color="D9D9D9"/>
+            </w:tcBorders>
+            <w:vAlign w:val="center"/>
+          </w:tcPr>
+          <w:p>
+            <w:pPr>
+              <w:spacing w:after="0"/>
+              <w:jc w:val="left"/>
+            </w:pPr>
+            <w:r/>
+            <w:r>
+              <w:rPr>
+                <w:rFonts w:ascii="Aptos" w:hAnsi="Aptos"/>
+                <w:b w:val="0"/>
+                <w:color w:val="000000"/>
+                <w:sz w:val="16"/>
+              </w:rPr>
+              <w:t>Define retention and deletion rules for resumes, parsed text, generated reports, and inactive accounts.</w:t>
+            </w:r>
+          </w:p>
+        </w:tc>
+      </w:tr>
+      <w:tr>
+        <w:tc>
+          <w:tcPr>
+            <w:tcW w:type="dxa" w:w="2160"/>
+            <w:shd w:fill="F4F7FA"/>
+            <w:tcBorders>
+              <w:top w:val="single" w:sz="6" w:color="D9D9D9"/>
+              <w:left w:val="single" w:sz="6" w:color="D9D9D9"/>
+              <w:bottom w:val="single" w:sz="6" w:color="D9D9D9"/>
+              <w:right w:val="single" w:sz="6" w:color="D9D9D9"/>
+            </w:tcBorders>
+            <w:vAlign w:val="center"/>
+          </w:tcPr>
+          <w:p>
+            <w:pPr>
+              <w:spacing w:after="0"/>
+              <w:jc w:val="left"/>
+            </w:pPr>
+            <w:r/>
+            <w:r>
+              <w:rPr>
+                <w:rFonts w:ascii="Aptos" w:hAnsi="Aptos"/>
+                <w:b w:val="0"/>
+                <w:color w:val="000000"/>
+                <w:sz w:val="16"/>
+              </w:rPr>
+              <w:t>Human review</w:t>
+            </w:r>
+          </w:p>
+        </w:tc>
+        <w:tc>
+          <w:tcPr>
+            <w:tcW w:type="dxa" w:w="7200"/>
+            <w:shd w:fill="F4F7FA"/>
+            <w:tcBorders>
+              <w:top w:val="single" w:sz="6" w:color="D9D9D9"/>
+              <w:left w:val="single" w:sz="6" w:color="D9D9D9"/>
+              <w:bottom w:val="single" w:sz="6" w:color="D9D9D9"/>
+              <w:right w:val="single" w:sz="6" w:color="D9D9D9"/>
+            </w:tcBorders>
+            <w:vAlign w:val="center"/>
+          </w:tcPr>
+          <w:p>
+            <w:pPr>
+              <w:spacing w:after="0"/>
+              <w:jc w:val="left"/>
+            </w:pPr>
+            <w:r/>
+            <w:r>
+              <w:rPr>
+                <w:rFonts w:ascii="Aptos" w:hAnsi="Aptos"/>
+                <w:b w:val="0"/>
+                <w:color w:val="000000"/>
+                <w:sz w:val="16"/>
+              </w:rPr>
+              <w:t>Allow users and faculty to correct extracted evidence, mappings, and recommendations before consequential use.</w:t>
+            </w:r>
+          </w:p>
+        </w:tc>
+      </w:tr>
+    </w:tbl>
+    <w:p>
+      <w:pPr>
+        <w:spacing w:after="0"/>
+      </w:pPr>
+    </w:p>
+    <w:p>
+      <w:pPr>
+        <w:pStyle w:val="Heading1"/>
+      </w:pPr>
+      <w:r>
+        <w:t>Interpretation</w:t>
+      </w:r>
+    </w:p>
+    <w:p>
+      <w:r>
+        <w:t>This report is a transparent snapshot of observed demand in the configured public feeds. It supports curriculum review, student preparation, and evidence-based advising. Decisions should combine this report with local employer input, longitudinal collections, faculty judgment, individual student evidence, and applicable institutional policy.</w:t>
+      </w:r>
+    </w:p>
     <w:sectPr>
       <w:footerReference w:type="default" r:id="rId9"/>
       <w:pgSz w:w="12240" w:h="15840"/>

</xml_diff>